<commit_message>
YG-13: Align test plan and talk outline with the video pipeline
Video output is checked through the narration, WebVTT cues and the
browser export instead of a server-side probe; the talk outline follows
the 15-slide deck and fits the 8-minute slot.
</commit_message>
<xml_diff>
--- a/docs/PreDefense_YeahGrind.docx
+++ b/docs/PreDefense_YeahGrind.docx
@@ -37164,7 +37164,7 @@
                 <w:sz w:val="18"/>
                 <w:szCs w:val="18"/>
               </w:rPr>
-              <w:t xml:space="preserve">Job tests with fake providers; ffprobe checks; benchmark B3</w:t>
+              <w:t xml:space="preserve">Job tests with fake providers; Playwright export check; benchmark B3</w:t>
             </w:r>
           </w:p>
         </w:tc>
@@ -37182,7 +37182,7 @@
                 <w:sz w:val="18"/>
                 <w:szCs w:val="18"/>
               </w:rPr>
-              <w:t xml:space="preserve">Job states; MP4 and WebVTT properties; seeded-error recall</w:t>
+              <w:t xml:space="preserve">Job states; narration and WebVTT properties; exported MP4/WebM plays; seeded-error recall</w:t>
             </w:r>
           </w:p>
         </w:tc>
@@ -41982,7 +41982,7 @@
                 <w:sz w:val="18"/>
                 <w:szCs w:val="18"/>
               </w:rPr>
-              <w:t xml:space="preserve">Status 202; job runs; MP4 60–120 s with audio and WebVTT</w:t>
+              <w:t xml:space="preserve">Status 202; job runs; narration 60–120 s with WebVTT; player exports MP4 or WebM</w:t>
             </w:r>
           </w:p>
         </w:tc>

</xml_diff>

<commit_message>
YG-13: Address the internal review of the pre-defense package
- Interviews: split H2 into H2a/H2b, align H8 with the status rule,
  report H10 as a preference, add limitations and audio handling.
- Remove the short-window premise left after H1 was contradicted.
- Aim and evaluation: pilot framing, a numeric gain threshold and the
  topic-condition allocation; B1-B6 labelled in section 9.
- Test cases TC-28 to TC-37 and a Requirements column, so every Must
  requirement has a test case.
- Sources: add T73, cite the uncited ones, drop T79, repair links.
- Gemini free-tier terms in NFR-06 and risk R13; release-1 rule in 05.
</commit_message>
<xml_diff>
--- a/docs/PreDefense_YeahGrind.docx
+++ b/docs/PreDefense_YeahGrind.docx
@@ -228,7 +228,7 @@
         <w:spacing w:after="40"/>
       </w:pPr>
       <w:r>
-        <w:t xml:space="preserve">Primary users: undergraduate students of Astana IT University (18+) who prepare for courses and exams on their own, in short study sessions, and who want explanations and feedback on their own subjects.</w:t>
+        <w:t xml:space="preserve">Primary users: undergraduate students of Astana IT University (18+) who prepare for courses and exams on their own, mostly in focused sessions shortly before deadlines, and who want explanations and feedback on their own subjects.</w:t>
       </w:r>
     </w:p>
     <w:p>
@@ -268,7 +268,7 @@
     <w:p>
       <w:pPr/>
       <w:r>
-        <w:t xml:space="preserve">To design, implement and evaluate a web platform that builds a personalized microlearning pathway for a student's goal or university subject, explains each micro-unit with a short generated video, assesses knowledge adaptively with a mastery estimate for every skill, and supports cooperative learning with friends and study groups, and to show that it gives higher learning gains and good usability compared with a non-adaptive baseline.</w:t>
+        <w:t xml:space="preserve">To design, implement and evaluate a web platform that builds a personalized microlearning pathway for a student's goal or university subject, explains each micro-unit with a short generated video, assesses knowledge adaptively with a mastery estimate for every skill, and supports cooperative learning with friends and study groups, and to compare its learning gains and usability with a non-adaptive baseline in a pilot study.</w:t>
       </w:r>
     </w:p>
     <w:p>
@@ -925,7 +925,7 @@
                 <w:sz w:val="20"/>
                 <w:szCs w:val="20"/>
               </w:rPr>
-              <w:t xml:space="preserve">Micro-units of 2–5 min; mobile-first PWA</w:t>
+              <w:t xml:space="preserve">Micro-units of 2–5 min, grouped into study sessions; phone and laptop</w:t>
             </w:r>
           </w:p>
         </w:tc>
@@ -1772,7 +1772,7 @@
                 <w:sz w:val="20"/>
                 <w:szCs w:val="20"/>
               </w:rPr>
-              <w:t xml:space="preserve">Small units; daily plan</w:t>
+              <w:t xml:space="preserve">Small first steps; a plan built around deadlines</w:t>
             </w:r>
           </w:p>
         </w:tc>
@@ -1966,7 +1966,7 @@
     <w:p>
       <w:pPr/>
       <w:r>
-        <w:t xml:space="preserve">Three semi-structured interviews were held in October 2026 with AITU students who are not involved in the project (Table 2.2): two transcribed conversations, one in Russian and one in English, and one set of written answers in English. The questions followed the interview guide in the project repository and asked about specific recent episodes: when and how long the student studied, how they chose what to study, how they learn a new topic, how they check what they know, how they study with others, how they react to AI feedback, leaderboards and streaks, and which language they prefer. The concept probe with prototype screens was not run, so no hypothesis relies on it. Names, teachers and courses are not recorded; the notes use the codes I-01 … I-03, and Russian quotes are translated.</w:t>
+        <w:t xml:space="preserve">Three semi-structured interviews were held in October 2026 with AITU students who are not involved in the project (Table 2.2): two transcribed conversations, one in Russian and one in English, and one set of written answers in English. The questions followed the interview guide in the project repository and asked about specific recent episodes: when and how long the student studied, how they chose what to study, how they learn a new topic, how they check what they know, how they study with others, how they react to AI feedback, leaderboards and streaks, and which language they prefer. The concept probe with prototype screens was not run, so no hypothesis relies on it. Names, teachers and courses are not recorded; the notes use the codes I-01 … I-03, and Russian quotes are translated. Audio recordings are kept only on the interviewer's encrypted device, never in the repository, and are deleted within 48 hours after the notes are written; the pseudonymized notes are not published and are shown to the supervisor and the committee on request.</w:t>
       </w:r>
     </w:p>
     <w:tbl>
@@ -2319,6 +2319,12 @@
       </w:r>
     </w:p>
     <w:p>
+      <w:pPr/>
+      <w:r>
+        <w:t xml:space="preserve">Limitations. The sample is small and not representative: three AITU students, two of whom use AI frequently or heavily (I-01, I-03). This raises the weight of AI use in H9 and in the new theme N1, so these results describe students who already use AI rather than all students. The interview results are used as design input for this project, not as general claims.</w:t>
+      </w:r>
+    </w:p>
+    <w:p>
       <w:pPr>
         <w:pStyle w:val="2"/>
       </w:pPr>
@@ -2401,7 +2407,7 @@
         <w:spacing w:after="40"/>
       </w:pPr>
       <w:r>
-        <w:t xml:space="preserve">Interviews I-01 … I-03 contradicted H1, supported H9 and H10 and gave mixed results for H2–H8; new themes are AI mistakes (N1), video for tired moments and short breaks (N2) and deadlines and grade stakes as the main priority (N3) (Section 2.6).</w:t>
+        <w:t xml:space="preserve">Interviews I-01 … I-03 contradicted H1 and H2a, supported H9, gave mixed results for H2b–H8 and recorded the preferred languages (H10); the new themes N1–N3 are described in Section 2.6.</w:t>
       </w:r>
     </w:p>
     <w:p>
@@ -2569,7 +2575,7 @@
                 <w:sz w:val="20"/>
                 <w:szCs w:val="20"/>
               </w:rPr>
-              <w:t xml:space="preserve">H2</w:t>
+              <w:t xml:space="preserve">H2a</w:t>
             </w:r>
           </w:p>
         </w:tc>
@@ -2587,7 +2593,7 @@
                 <w:sz w:val="20"/>
                 <w:szCs w:val="20"/>
               </w:rPr>
-              <w:t xml:space="preserve">Deadlines come from several channels; consolidating them is manual.</w:t>
+              <w:t xml:space="preserve">Deadlines come from several channels.</w:t>
             </w:r>
           </w:p>
         </w:tc>
@@ -2605,7 +2611,7 @@
                 <w:sz w:val="20"/>
                 <w:szCs w:val="20"/>
               </w:rPr>
-              <w:t xml:space="preserve">Mixed. Moodle is the only deadline source for all three; checking it is manual and daily (I-01).</w:t>
+              <w:t xml:space="preserve">Contradicted. Moodle is the only deadline source for all three (I-01, I-02, I-03).</w:t>
             </w:r>
           </w:p>
         </w:tc>
@@ -2628,7 +2634,7 @@
                 <w:sz w:val="20"/>
                 <w:szCs w:val="20"/>
               </w:rPr>
-              <w:t xml:space="preserve">H3</w:t>
+              <w:t xml:space="preserve">H2b</w:t>
             </w:r>
           </w:p>
         </w:tc>
@@ -2646,7 +2652,7 @@
                 <w:sz w:val="20"/>
                 <w:szCs w:val="20"/>
               </w:rPr>
-              <w:t xml:space="preserve">Choosing the next study step is a real barrier to starting.</w:t>
+              <w:t xml:space="preserve">Keeping track of deadlines takes manual effort.</w:t>
             </w:r>
           </w:p>
         </w:tc>
@@ -2664,7 +2670,7 @@
                 <w:sz w:val="20"/>
                 <w:szCs w:val="20"/>
               </w:rPr>
-              <w:t xml:space="preserve">Mixed. I-02 follows the nearest deadline; I-03 sometimes does not know where to start; I-01 works down a to-do list.</w:t>
+              <w:t xml:space="preserve">Mixed. I-01 checks Moodle every day "in a rush"; I-02 checks it briefly; I-03 gives no episode.</w:t>
             </w:r>
           </w:p>
         </w:tc>
@@ -2687,7 +2693,7 @@
                 <w:sz w:val="20"/>
                 <w:szCs w:val="20"/>
               </w:rPr>
-              <w:t xml:space="preserve">H4</w:t>
+              <w:t xml:space="preserve">H3</w:t>
             </w:r>
           </w:p>
         </w:tc>
@@ -2705,7 +2711,7 @@
                 <w:sz w:val="20"/>
                 <w:szCs w:val="20"/>
               </w:rPr>
-              <w:t xml:space="preserve">For a new topic, students prefer a short video to long text if its sources are visible.</w:t>
+              <w:t xml:space="preserve">Choosing the next study step is a real barrier to starting.</w:t>
             </w:r>
           </w:p>
         </w:tc>
@@ -2723,7 +2729,7 @@
                 <w:sz w:val="20"/>
                 <w:szCs w:val="20"/>
               </w:rPr>
-              <w:t xml:space="preserve">Mixed. All three combine text and video: video complements text (tired moments, examples, visualizing) but does not replace it.</w:t>
+              <w:t xml:space="preserve">Mixed. I-02 follows the nearest deadline; I-03 sometimes does not know where to start; I-01 works down a to-do list.</w:t>
             </w:r>
           </w:p>
         </w:tc>
@@ -2746,7 +2752,7 @@
                 <w:sz w:val="20"/>
                 <w:szCs w:val="20"/>
               </w:rPr>
-              <w:t xml:space="preserve">H5</w:t>
+              <w:t xml:space="preserve">H4</w:t>
             </w:r>
           </w:p>
         </w:tc>
@@ -2764,7 +2770,7 @@
                 <w:sz w:val="20"/>
                 <w:szCs w:val="20"/>
               </w:rPr>
-              <w:t xml:space="preserve">Students discover gaps late and would use short adaptive quizzes that show progress.</w:t>
+              <w:t xml:space="preserve">For a new topic, students prefer a short video to long text if its sources are visible.</w:t>
             </w:r>
           </w:p>
         </w:tc>
@@ -2782,7 +2788,7 @@
                 <w:sz w:val="20"/>
                 <w:szCs w:val="20"/>
               </w:rPr>
-              <w:t xml:space="preserve">Mixed. I-02 sometimes finds gaps; I-01 assumes understanding after finishing a task; I-03 finds no late gaps and checks understanding by answering questions.</w:t>
+              <w:t xml:space="preserve">Mixed. All three combine text and video: video complements text (tired moments, examples, visualizing) but does not replace it.</w:t>
             </w:r>
           </w:p>
         </w:tc>
@@ -2805,7 +2811,7 @@
                 <w:sz w:val="20"/>
                 <w:szCs w:val="20"/>
               </w:rPr>
-              <w:t xml:space="preserve">H6</w:t>
+              <w:t xml:space="preserve">H5</w:t>
             </w:r>
           </w:p>
         </w:tc>
@@ -2823,7 +2829,7 @@
                 <w:sz w:val="20"/>
                 <w:szCs w:val="20"/>
               </w:rPr>
-              <w:t xml:space="preserve">Students prefer feedback that explains mistakes to receiving the full answer.</w:t>
+              <w:t xml:space="preserve">Students discover gaps late and would use short adaptive quizzes that show progress.</w:t>
             </w:r>
           </w:p>
         </w:tc>
@@ -2841,7 +2847,7 @@
                 <w:sz w:val="20"/>
                 <w:szCs w:val="20"/>
               </w:rPr>
-              <w:t xml:space="preserve">Mixed. All three want mistakes explained; I-01 and I-03 want the correct answer right after the attempt.</w:t>
+              <w:t xml:space="preserve">Mixed. I-02 sometimes finds gaps; I-01 assumes understanding after finishing a task; I-03 finds no late gaps and checks understanding by answering questions.</w:t>
             </w:r>
           </w:p>
         </w:tc>
@@ -2864,7 +2870,7 @@
                 <w:sz w:val="20"/>
                 <w:szCs w:val="20"/>
               </w:rPr>
-              <w:t xml:space="preserve">H7</w:t>
+              <w:t xml:space="preserve">H6</w:t>
             </w:r>
           </w:p>
         </w:tc>
@@ -2882,7 +2888,7 @@
                 <w:sz w:val="20"/>
                 <w:szCs w:val="20"/>
               </w:rPr>
-              <w:t xml:space="preserve">Students want to learn with peers, keep scores private and prefer cooperation to ranking.</w:t>
+              <w:t xml:space="preserve">Students prefer feedback that explains mistakes to receiving the full answer.</w:t>
             </w:r>
           </w:p>
         </w:tc>
@@ -2900,7 +2906,7 @@
                 <w:sz w:val="20"/>
                 <w:szCs w:val="20"/>
               </w:rPr>
-              <w:t xml:space="preserve">Mixed. I-03 studies with friends and keeps scores private; I-02 wants to compare scores to discuss mistakes; I-01 is motivated by leaderboards.</w:t>
+              <w:t xml:space="preserve">Mixed. All three want mistakes explained; I-01 and I-03 want the correct answer right after the attempt.</w:t>
             </w:r>
           </w:p>
         </w:tc>
@@ -2923,7 +2929,7 @@
                 <w:sz w:val="20"/>
                 <w:szCs w:val="20"/>
               </w:rPr>
-              <w:t xml:space="preserve">H8</w:t>
+              <w:t xml:space="preserve">H7</w:t>
             </w:r>
           </w:p>
         </w:tc>
@@ -2941,7 +2947,7 @@
                 <w:sz w:val="20"/>
                 <w:szCs w:val="20"/>
               </w:rPr>
-              <w:t xml:space="preserve">Punitive mechanics (streak loss, league demotion) demotivate.</w:t>
+              <w:t xml:space="preserve">Students want to learn with peers, keep scores private and prefer cooperation to ranking.</w:t>
             </w:r>
           </w:p>
         </w:tc>
@@ -2959,7 +2965,7 @@
                 <w:sz w:val="20"/>
                 <w:szCs w:val="20"/>
               </w:rPr>
-              <w:t xml:space="preserve">Mixed (not supported). No one reported demotivation; competition (I-01) and grade stakes (I-03) motivate; I-02 is unaffected.</w:t>
+              <w:t xml:space="preserve">Mixed. I-03 studies with friends and keeps scores private; I-02 wants to compare scores to discuss mistakes; I-01 is motivated by leaderboards.</w:t>
             </w:r>
           </w:p>
         </w:tc>
@@ -2982,7 +2988,7 @@
                 <w:sz w:val="20"/>
                 <w:szCs w:val="20"/>
               </w:rPr>
-              <w:t xml:space="preserve">H9</w:t>
+              <w:t xml:space="preserve">H8</w:t>
             </w:r>
           </w:p>
         </w:tc>
@@ -3000,7 +3006,7 @@
                 <w:sz w:val="20"/>
                 <w:szCs w:val="20"/>
               </w:rPr>
-              <w:t xml:space="preserve">Students share study context and answers with AI services, not their identity, and want control.</w:t>
+              <w:t xml:space="preserve">Punitive mechanics (streak loss, league demotion) demotivate.</w:t>
             </w:r>
           </w:p>
         </w:tc>
@@ -3018,7 +3024,7 @@
                 <w:sz w:val="20"/>
                 <w:szCs w:val="20"/>
               </w:rPr>
-              <w:t xml:space="preserve">Supported. All three upload study notes to AI; I-02 expects that personal data does not leak; I-03 shares only non-private information.</w:t>
+              <w:t xml:space="preserve">Mixed. No participant supports it: competition motivates I-01 and grade stakes motivate I-03, which contradicts it; I-02 is unaffected.</w:t>
             </w:r>
           </w:p>
         </w:tc>
@@ -3041,6 +3047,65 @@
                 <w:sz w:val="20"/>
                 <w:szCs w:val="20"/>
               </w:rPr>
+              <w:t xml:space="preserve">H9</w:t>
+            </w:r>
+          </w:p>
+        </w:tc>
+        <w:tc>
+          <w:tcPr>
+            <w:tcW w:w="3400" w:type="dxa"/>
+          </w:tcPr>
+          <w:p>
+            <w:pPr>
+              <w:spacing w:after="0" w:line="240" w:lineRule="auto"/>
+              <w:jc w:val="left"/>
+            </w:pPr>
+            <w:r>
+              <w:rPr>
+                <w:sz w:val="20"/>
+                <w:szCs w:val="20"/>
+              </w:rPr>
+              <w:t xml:space="preserve">Students share study context and answers with AI services, not their identity, and want control.</w:t>
+            </w:r>
+          </w:p>
+        </w:tc>
+        <w:tc>
+          <w:tcPr>
+            <w:tcW w:w="5026" w:type="dxa"/>
+          </w:tcPr>
+          <w:p>
+            <w:pPr>
+              <w:spacing w:after="0" w:line="240" w:lineRule="auto"/>
+              <w:jc w:val="left"/>
+            </w:pPr>
+            <w:r>
+              <w:rPr>
+                <w:sz w:val="20"/>
+                <w:szCs w:val="20"/>
+              </w:rPr>
+              <w:t xml:space="preserve">Supported. All three upload study notes to AI; I-02 expects that personal data does not leak; I-03 shares only non-private information.</w:t>
+            </w:r>
+          </w:p>
+        </w:tc>
+      </w:tr>
+      <w:tr>
+        <w:trPr>
+          <w:cantSplit/>
+        </w:trPr>
+        <w:tc>
+          <w:tcPr>
+            <w:tcW w:w="600" w:type="dxa"/>
+          </w:tcPr>
+          <w:p>
+            <w:pPr>
+              <w:spacing w:after="0" w:line="240" w:lineRule="auto"/>
+              <w:jc w:val="left"/>
+            </w:pPr>
+            <w:r>
+              <w:rPr>
+                <w:sz w:val="20"/>
+                <w:szCs w:val="20"/>
+              </w:rPr>
               <w:t xml:space="preserve">H10</w:t>
             </w:r>
           </w:p>
@@ -3077,7 +3142,7 @@
                 <w:sz w:val="20"/>
                 <w:szCs w:val="20"/>
               </w:rPr>
-              <w:t xml:space="preserve">Supported. English suits all three and Russian also suits I-02; Kazakh is wanted only for a Kazakh-language subject (I-01).</w:t>
+              <w:t xml:space="preserve">Preference question, reported without a status. English suits all three and Russian also suits I-02; Kazakh is wanted only for a Kazakh-language subject (I-01).</w:t>
             </w:r>
           </w:p>
         </w:tc>
@@ -3101,7 +3166,13 @@
     <w:p>
       <w:pPr/>
       <w:r>
-        <w:t xml:space="preserve">A hypothesis is supported when at least three participants give a concrete supporting episode and none contradict it, contradicted when at least three contradict it, and mixed otherwise. With three participants, a hypothesis is supported only when all three support it. New themes mentioned by two or more participants become candidate requirements.</w:t>
+        <w:t xml:space="preserve">A hypothesis is supported when at least three participants give a concrete supporting episode and none contradict it, contradicted when at least three contradict it, and mixed otherwise. With three participants, a hypothesis is supported only when all three support it. H10 asks for a preference rather than testing a claim, so it is reported without a status. New themes mentioned by two or more participants become candidate requirements.</w:t>
+      </w:r>
+    </w:p>
+    <w:p>
+      <w:pPr/>
+      <w:r>
+        <w:t xml:space="preserve">New themes. N1: AI answers can be wrong or too general (I-01, I-02), so generated content is grounded in the unit text and shows its sources (FR-21, FR-24). N2: video suits tired moments and short breaks (I-01, I-03), so at low energy the day plan suggests the unit video first (FR-12). N3: deadlines and grade stakes set priorities (I-02, I-03), so the deadline factor stays in the pathway priority (FR-11). A fourth theme, friends who help to stay focused (I-03), was mentioned by one participant only and does not become a requirement.</w:t>
       </w:r>
     </w:p>
     <w:p>
@@ -3115,7 +3186,7 @@
     <w:p>
       <w:pPr/>
       <w:r>
-        <w:t xml:space="preserve">The published evidence and the observation define the core design: micro-units fitted to free time (E1, E12), short videos always paired with practice (E2, E3), automatic validation and moderation of generated content (E4, E7), Elo-based adaptive quizzes with spaced review (E5, E6), feedback that teaches rather than answers (E7–E9), cooperative groups without penalties (E10, E11), and privacy controls (E13). The interview results set the priorities: a supported hypothesis keeps or raises the priority of its requirements, a contradicted one lowers it or changes the acceptance criteria. The interviews contradicted H1: all three participants study in long focused sessions, so the day plan groups several micro-units into one session and offers the unit video for short breaks and tired moments. H6 changed the feedback design: hints stay optional before an attempt, and the correct answer with its explanation is shown right after it. H9 and H10 confirmed the privacy requirements and the language priorities (English, then Russian; Kazakh by subject). Mixed results for H7 and H8 keep scores private by default, shared only on purpose, and leave ranking out of release 1. The mapping from each finding to requirements is given in Section 6.6.</w:t>
+        <w:t xml:space="preserve">The published evidence and the observation define the core design: small micro-units grouped into study sessions that fit the time the student has (E1, E12), short videos always paired with practice (E2, E3), automatic validation and moderation of generated content (E4, E7), Elo-based adaptive quizzes with spaced review (E5, E6), feedback that teaches rather than answers (E7–E9), cooperative groups without penalties (E10, E11), and privacy controls (E13). The interview results set the priorities: a supported hypothesis keeps or raises the priority of its requirements, a contradicted one lowers it or changes the acceptance criteria. The interviews contradicted H1: all three participants study in long focused sessions, so the day plan groups several micro-units into one session and offers the unit video for short breaks and tired moments. H6 changed the feedback design: hints stay optional before an attempt, and the correct answer with its explanation is shown right after it. H9 confirmed the privacy requirements, and the language preferences recorded under H10 set the language priorities (English, then Russian; Kazakh by subject). Mixed results for H7 and H8 keep scores private by default, shared only on purpose, and leave ranking out of release 1. The mapping from each finding to requirements is given in Section 6.6.</w:t>
       </w:r>
     </w:p>
     <w:p>
@@ -3154,7 +3225,7 @@
     <w:p>
       <w:pPr/>
       <w:r>
-        <w:t xml:space="preserve">Twenty-eight sources were selected: 27 peer-reviewed publications and one intergovernmental guidance document. Twenty sources are from 2021–2026, reflecting the fast development of AI in education; six foundational works (2007–2016) are kept because current models and principles build on them. Every DOI was resolved through the Crossref API on 21 October 2026 and checked against title, authors, venue and pages, and every source was checked for retractions and corrections. One frequently cited 2025 meta-analysis on ChatGPT was excluded because it was retracted in April 2026. Content was read from the full text for 17 sources and from the abstract for 11. Discovery used Crossref, Semantic Scholar, OpenAlex, Europe PMC and arXiv. Inclusion required a peer-reviewed meta-analysis, systematic review, controlled experiment, large-scale log study or seminal model, a direct link to a platform feature, and readable content; preprints and low-visibility outlets were excluded when stronger evidence existed.</w:t>
+        <w:t xml:space="preserve">Twenty-eight sources were selected: 27 peer-reviewed publications and one intergovernmental guidance document. Twenty sources are from 2021–2026, reflecting the fast development of AI in education; eight earlier works (1995–2020) are kept because current models and principles build on them. Every DOI was resolved through the Crossref API on 21 October 2026 and checked against title, authors, venue and pages, and every source was checked for retractions and corrections. One frequently cited 2025 meta-analysis on ChatGPT was excluded because it was retracted in April 2026. Content was read from the full text for 17 sources and from the abstract for 11. Discovery used Crossref, Semantic Scholar, OpenAlex, Europe PMC and arXiv. Inclusion required a peer-reviewed meta-analysis, systematic review, controlled experiment, large-scale log study or seminal model, a direct link to a platform feature, and readable content; preprints and low-visibility outlets were excluded when stronger evidence existed.</w:t>
       </w:r>
     </w:p>
     <w:p>
@@ -7239,7 +7310,7 @@
                 <w:sz w:val="20"/>
                 <w:szCs w:val="20"/>
               </w:rPr>
-              <w:t xml:space="preserve">Uses the learner's own LMS deadlines and fits lessons into free time</w:t>
+              <w:t xml:space="preserve">Uses the learner's own LMS deadlines and plans study into the time the learner has</w:t>
             </w:r>
           </w:p>
         </w:tc>
@@ -10833,7 +10904,7 @@
         <w:spacing w:after="40"/>
       </w:pPr>
       <w:r>
-        <w:t xml:space="preserve">G5. No system fits learning into the student's day using free time and personal Moodle deadlines; LMS integrations are institutional.</w:t>
+        <w:t xml:space="preserve">G5. None of the five analyzed systems plans study around the student's available time and personal Moodle deadlines; their LMS integrations are institutional.</w:t>
       </w:r>
     </w:p>
     <w:p>
@@ -11448,7 +11519,7 @@
                 <w:sz w:val="20"/>
                 <w:szCs w:val="20"/>
               </w:rPr>
-              <w:t xml:space="preserve">Personal Moodle deadlines + free time</w:t>
+              <w:t xml:space="preserve">Personal Moodle deadlines + time available today</w:t>
             </w:r>
           </w:p>
         </w:tc>
@@ -12080,6 +12151,12 @@
       <w:pPr/>
       <w:r>
         <w:t xml:space="preserve">Thirteen decisions are compared, each with three alternatives. Every option was scored 1–5 against seven criteria derived from these requirements, with weights summing to 100 %. Under each decision, Tables 5.1–5.13 give the criteria, their weights and the score of every option; the weighted total is Σ(weight × score) / 100, with a maximum of 5.00. Versions and prices were checked on official pages on 21 October 2026.</w:t>
+      </w:r>
+    </w:p>
+    <w:p>
+      <w:pPr/>
+      <w:r>
+        <w:t xml:space="preserve">In four decisions (authentication, text-to-speech, media storage and background jobs) release 1 does not use the top-scoring option. There the score names the target, and release 1 uses a simpler option for a stated delivery reason: an integration the team has already tested, no paid subscription during development, or a scale at which a second system adds more work than it saves. Team readiness is deliberately kept out of the weighted criteria, so that it does not change the comparison of the technologies themselves; instead, each of these decisions names the condition for switching to the target.</w:t>
       </w:r>
     </w:p>
     <w:p>
@@ -22124,7 +22201,7 @@
                 <w:sz w:val="20"/>
                 <w:szCs w:val="20"/>
               </w:rPr>
-              <w:t xml:space="preserve">Any React/SVG animation with frame-exact timing; free license for teams of up to 3 [T71][T74].</w:t>
+              <w:t xml:space="preserve">Any React/SVG animation with frame-exact timing; free license for teams of up to 3 [T71][T74]; release 4.0.537 of 19 Oct 2026 [T75].</w:t>
             </w:r>
           </w:p>
         </w:tc>
@@ -22142,7 +22219,7 @@
                 <w:sz w:val="20"/>
                 <w:szCs w:val="20"/>
               </w:rPr>
-              <w:t xml:space="preserve">Headless Chrome needs more RAM/CPU, or AWS Lambda at ≈ USD 8–9 per 300 videos [T73].</w:t>
+              <w:t xml:space="preserve">Headless Chrome needs more RAM/CPU, or AWS Lambda at ≈ USD 8–9 per 300 videos [T73]; automated rendering in a company costs USD 0.01 per render with a USD 100 monthly minimum [T72].</w:t>
             </w:r>
           </w:p>
         </w:tc>
@@ -22160,7 +22237,7 @@
         <w:t xml:space="preserve">Choice:</w:t>
       </w:r>
       <w:r>
-        <w:t xml:space="preserve"> Client-side rendering: the server produces a validated script and one narration track; the browser plays the slides in sync with the audio and records the same frames on request. The server template pipeline stays the upgrade path for server-side video files.</w:t>
+        <w:t xml:space="preserve"> Client-side rendering: the server produces a validated script and one narration track; the browser plays the slides in sync with the audio and records the same frames on request; the narration is added to the recording as an audio track [T120]. The server template pipeline stays the upgrade path for server-side video files.</w:t>
       </w:r>
     </w:p>
     <w:p>
@@ -22168,7 +22245,7 @@
         <w:spacing w:after="200"/>
       </w:pPr>
       <w:r>
-        <w:t xml:space="preserve">Weighted score 4.60 against 4.45 (server template pipeline) and 4.35 (Remotion).</w:t>
+        <w:t xml:space="preserve">Weighted score 4.60 against 4.45 (server template pipeline) and 4.35 (Remotion). Third-party avatar video was excluded: HeyGen costs about USD 1–4 per video minute [T78], and Synthesia lists no Kazakh voice [T80][T81].</w:t>
       </w:r>
     </w:p>
     <w:p>
@@ -23364,7 +23441,7 @@
         <w:t xml:space="preserve">Choice:</w:t>
       </w:r>
       <w:r>
-        <w:t xml:space="preserve"> Release 1: Gemini TTS behind a TTS adapter, one request per video and a fallback across Gemini models; the paid tier is enabled before the pilot. Azure AI Speech is the target: a native-speaker test decides whether Kazakh moves to its kk-KZ voices. Every video is labeled "AI-generated voice".</w:t>
+        <w:t xml:space="preserve"> Release 1: Gemini TTS behind a TTS adapter, one request per video and a fallback across Gemini models; the paid tier, billed per audio output token [T125], is enabled before the pilot, because on the free tier Google may use submitted content to improve its products [T124]. Azure AI Speech is the target: a native-speaker test decides whether Kazakh moves to its kk-KZ voices. Every video is labeled "AI-generated voice".</w:t>
       </w:r>
     </w:p>
     <w:p>
@@ -23372,7 +23449,7 @@
         <w:spacing w:after="200"/>
       </w:pPr>
       <w:r>
-        <w:t xml:space="preserve">Weighted score 4.05 against 4.70 (Azure AI Speech, the target) and 3.55 (ElevenLabs). Gemini comes first because the team already has a working key and integration and needs no cloud subscription to start.</w:t>
+        <w:t xml:space="preserve">Weighted score 4.05 against 4.70 (Azure AI Speech, the target) and 3.55 (ElevenLabs). Gemini comes first because the team already has a working key and integration and needs no cloud subscription to start. OpenAI TTS was excluded: its speech models are removed from the API on 6 January 2027, and the replacement model works only through the Realtime API [T82][T83][T84].</w:t>
       </w:r>
     </w:p>
     <w:p>
@@ -24568,7 +24645,7 @@
         <w:t xml:space="preserve">Choice:</w:t>
       </w:r>
       <w:r>
-        <w:t xml:space="preserve"> Release 1: narration audio in PostgreSQL bytea next to the video row, served with range support and deleted with the goal. Object storage is the target when stored media exceed about 5 GB, when server-side video files are added or when a CDN is needed.</w:t>
+        <w:t xml:space="preserve"> Release 1: narration audio in PostgreSQL bytea next to the video row, served with range support and deleted with the goal. Object storage is the target when stored media exceed about 5 GB, when server-side video files are added or when a CDN is needed. Candidates are Cloudflare R2 behind a custom domain, because r2.dev URLs are meant for development only [T96], and Railway Storage Buckets, which are private-only and have no automatic backups [T97].</w:t>
       </w:r>
     </w:p>
     <w:p>
@@ -25772,7 +25849,7 @@
         <w:t xml:space="preserve">Choice:</w:t>
       </w:r>
       <w:r>
-        <w:t xml:space="preserve"> Release 1: in-process jobs with a conditional-update claim renewed between steps (stale jobs restarted, at most 3 attempts); GitHub Actions schedules for the Moodle refresh three times a day and reminders. pg-boss is the target when server-side rendering returns or job types grow.</w:t>
+        <w:t xml:space="preserve"> Release 1: in-process jobs with a conditional-update claim renewed between steps (stale jobs restarted, at most 3 attempts); GitHub Actions schedules for the Moodle refresh three times a day and reminders; Railway cron was not used because runs must be at least 5 minutes apart and an overlapping run is skipped [T58]. pg-boss is the target when server-side rendering returns or job types grow; its singleton keys throttle or deduplicate jobs per key [T104].</w:t>
       </w:r>
     </w:p>
     <w:p>
@@ -30286,6 +30363,44 @@
           <w:sz w:val="20"/>
           <w:szCs w:val="20"/>
         </w:rPr>
+        <w:t xml:space="preserve">[T73] Remotion. </w:t>
+      </w:r>
+      <w:r>
+        <w:rPr>
+          <w:i/>
+          <w:iCs/>
+          <w:sz w:val="20"/>
+          <w:szCs w:val="20"/>
+        </w:rPr>
+        <w:t xml:space="preserve">Lambda: cost examples</w:t>
+      </w:r>
+      <w:r>
+        <w:rPr>
+          <w:sz w:val="20"/>
+          <w:szCs w:val="20"/>
+        </w:rPr>
+        <w:t xml:space="preserve">. </w:t>
+      </w:r>
+      <w:hyperlink r:id="rId7" w:history="1">
+        <w:r>
+          <w:rPr>
+            <w:rStyle w:val="a6"/>
+            <w:sz w:val="20"/>
+            <w:szCs w:val="20"/>
+          </w:rPr>
+          <w:t xml:space="preserve">https://www.remotion.dev/docs/lambda/cost-example</w:t>
+        </w:r>
+      </w:hyperlink>
+    </w:p>
+    <w:p>
+      <w:pPr>
+        <w:spacing w:after="60"/>
+      </w:pPr>
+      <w:r>
+        <w:rPr>
+          <w:sz w:val="20"/>
+          <w:szCs w:val="20"/>
+        </w:rPr>
         <w:t xml:space="preserve">[T74] Remotion. </w:t>
       </w:r>
       <w:r>
@@ -30476,44 +30591,6 @@
           <w:sz w:val="20"/>
           <w:szCs w:val="20"/>
         </w:rPr>
-        <w:t xml:space="preserve">[T79] HeyGen Help Center. </w:t>
-      </w:r>
-      <w:r>
-        <w:rPr>
-          <w:i/>
-          <w:iCs/>
-          <w:sz w:val="20"/>
-          <w:szCs w:val="20"/>
-        </w:rPr>
-        <w:t xml:space="preserve">Voice: Languages We Support</w:t>
-      </w:r>
-      <w:r>
-        <w:rPr>
-          <w:sz w:val="20"/>
-          <w:szCs w:val="20"/>
-        </w:rPr>
-        <w:t xml:space="preserve">. </w:t>
-      </w:r>
-      <w:hyperlink r:id="rId1119" w:history="1">
-        <w:r>
-          <w:rPr>
-            <w:rStyle w:val="a6"/>
-            <w:sz w:val="20"/>
-            <w:szCs w:val="20"/>
-          </w:rPr>
-          <w:t xml:space="preserve">https://help.heygen.com/en/articles/11391932-voice-languages-we-support</w:t>
-        </w:r>
-      </w:hyperlink>
-    </w:p>
-    <w:p>
-      <w:pPr>
-        <w:spacing w:after="60"/>
-      </w:pPr>
-      <w:r>
-        <w:rPr>
-          <w:sz w:val="20"/>
-          <w:szCs w:val="20"/>
-        </w:rPr>
         <w:t xml:space="preserve">[T80] Synthesia. </w:t>
       </w:r>
       <w:r>
@@ -31624,9 +31701,18 @@
           <w:sz w:val="20"/>
           <w:szCs w:val="20"/>
         </w:rPr>
-        <w:t xml:space="preserve">[T117] MDN Web Docs. HTMLCanvasElement: captureStream() method. https://developer.mozilla.org/en-US/docs/Web/API/HTMLCanvasElement/captureStream</w:t>
-      </w:r>
-      <w:hyperlink r:id="rId1147" w:history="1"/>
+        <w:t xml:space="preserve">[T117] MDN Web Docs. HTMLCanvasElement: captureStream() method. </w:t>
+      </w:r>
+      <w:hyperlink r:id="rId8" w:history="1">
+        <w:r>
+          <w:rPr>
+            <w:rStyle w:val="a6"/>
+            <w:sz w:val="20"/>
+            <w:szCs w:val="20"/>
+          </w:rPr>
+          <w:t xml:space="preserve">https://developer.mozilla.org/en-US/docs/Web/API/HTMLCanvasElement/captureStream</w:t>
+        </w:r>
+      </w:hyperlink>
     </w:p>
     <w:p>
       <w:pPr>
@@ -31637,9 +31723,18 @@
           <w:sz w:val="20"/>
           <w:szCs w:val="20"/>
         </w:rPr>
-        <w:t xml:space="preserve">[T118] MDN Web Docs. MediaRecorder. https://developer.mozilla.org/en-US/docs/Web/API/MediaRecorder</w:t>
-      </w:r>
-      <w:hyperlink r:id="rId1147" w:history="1"/>
+        <w:t xml:space="preserve">[T118] MDN Web Docs. MediaRecorder. </w:t>
+      </w:r>
+      <w:hyperlink r:id="rId9" w:history="1">
+        <w:r>
+          <w:rPr>
+            <w:rStyle w:val="a6"/>
+            <w:sz w:val="20"/>
+            <w:szCs w:val="20"/>
+          </w:rPr>
+          <w:t xml:space="preserve">https://developer.mozilla.org/en-US/docs/Web/API/MediaRecorder</w:t>
+        </w:r>
+      </w:hyperlink>
     </w:p>
     <w:p>
       <w:pPr>
@@ -31650,9 +31745,18 @@
           <w:sz w:val="20"/>
           <w:szCs w:val="20"/>
         </w:rPr>
-        <w:t xml:space="preserve">[T119] MDN Web Docs. MediaRecorder: isTypeSupported() static method. https://developer.mozilla.org/en-US/docs/Web/API/MediaRecorder/isTypeSupported_static</w:t>
-      </w:r>
-      <w:hyperlink r:id="rId1147" w:history="1"/>
+        <w:t xml:space="preserve">[T119] MDN Web Docs. MediaRecorder: isTypeSupported() static method. </w:t>
+      </w:r>
+      <w:hyperlink r:id="rId10" w:history="1">
+        <w:r>
+          <w:rPr>
+            <w:rStyle w:val="a6"/>
+            <w:sz w:val="20"/>
+            <w:szCs w:val="20"/>
+          </w:rPr>
+          <w:t xml:space="preserve">https://developer.mozilla.org/en-US/docs/Web/API/MediaRecorder/isTypeSupported_static</w:t>
+        </w:r>
+      </w:hyperlink>
     </w:p>
     <w:p>
       <w:pPr>
@@ -31663,9 +31767,18 @@
           <w:sz w:val="20"/>
           <w:szCs w:val="20"/>
         </w:rPr>
-        <w:t xml:space="preserve">[T120] MDN Web Docs. AudioContext: createMediaStreamDestination() method. https://developer.mozilla.org/en-US/docs/Web/API/AudioContext/createMediaStreamDestination</w:t>
-      </w:r>
-      <w:hyperlink r:id="rId1147" w:history="1"/>
+        <w:t xml:space="preserve">[T120] MDN Web Docs. AudioContext: createMediaStreamDestination() method. </w:t>
+      </w:r>
+      <w:hyperlink r:id="rId11" w:history="1">
+        <w:r>
+          <w:rPr>
+            <w:rStyle w:val="a6"/>
+            <w:sz w:val="20"/>
+            <w:szCs w:val="20"/>
+          </w:rPr>
+          <w:t xml:space="preserve">https://developer.mozilla.org/en-US/docs/Web/API/AudioContext/createMediaStreamDestination</w:t>
+        </w:r>
+      </w:hyperlink>
     </w:p>
     <w:p>
       <w:pPr>
@@ -31676,9 +31789,18 @@
           <w:sz w:val="20"/>
           <w:szCs w:val="20"/>
         </w:rPr>
-        <w:t xml:space="preserve">[T121] Google AI for Developers. Gemini models (audio models: Gemini 3.8 Flash TTS, Gemini 3.8 Flash-Lite TTS). https://ai.google.dev/gemini-api/docs/models</w:t>
-      </w:r>
-      <w:hyperlink r:id="rId1147" w:history="1"/>
+        <w:t xml:space="preserve">[T121] Google AI for Developers. Gemini models (audio models: Gemini 3.8 Flash TTS, Gemini 3.8 Flash-Lite TTS). </w:t>
+      </w:r>
+      <w:hyperlink r:id="rId12" w:history="1">
+        <w:r>
+          <w:rPr>
+            <w:rStyle w:val="a6"/>
+            <w:sz w:val="20"/>
+            <w:szCs w:val="20"/>
+          </w:rPr>
+          <w:t xml:space="preserve">https://ai.google.dev/gemini-api/docs/models</w:t>
+        </w:r>
+      </w:hyperlink>
     </w:p>
     <w:p>
       <w:pPr>
@@ -31689,9 +31811,18 @@
           <w:sz w:val="20"/>
           <w:szCs w:val="20"/>
         </w:rPr>
-        <w:t xml:space="preserve">[T122] Google AI for Developers. Speech generation (text-to-speech). https://ai.google.dev/gemini-api/docs/speech-generation</w:t>
-      </w:r>
-      <w:hyperlink r:id="rId1147" w:history="1"/>
+        <w:t xml:space="preserve">[T122] Google AI for Developers. Speech generation (text-to-speech). </w:t>
+      </w:r>
+      <w:hyperlink r:id="rId13" w:history="1">
+        <w:r>
+          <w:rPr>
+            <w:rStyle w:val="a6"/>
+            <w:sz w:val="20"/>
+            <w:szCs w:val="20"/>
+          </w:rPr>
+          <w:t xml:space="preserve">https://ai.google.dev/gemini-api/docs/speech-generation</w:t>
+        </w:r>
+      </w:hyperlink>
     </w:p>
     <w:p>
       <w:pPr>
@@ -31702,9 +31833,18 @@
           <w:sz w:val="20"/>
           <w:szCs w:val="20"/>
         </w:rPr>
-        <w:t xml:space="preserve">[T123] Google AI for Developers. Rate limits. https://ai.google.dev/gemini-api/docs/rate-limits</w:t>
-      </w:r>
-      <w:hyperlink r:id="rId1147" w:history="1"/>
+        <w:t xml:space="preserve">[T123] Google AI for Developers. Rate limits. </w:t>
+      </w:r>
+      <w:hyperlink r:id="rId14" w:history="1">
+        <w:r>
+          <w:rPr>
+            <w:rStyle w:val="a6"/>
+            <w:sz w:val="20"/>
+            <w:szCs w:val="20"/>
+          </w:rPr>
+          <w:t xml:space="preserve">https://ai.google.dev/gemini-api/docs/rate-limits</w:t>
+        </w:r>
+      </w:hyperlink>
     </w:p>
     <w:p>
       <w:pPr>
@@ -31715,9 +31855,18 @@
           <w:sz w:val="20"/>
           <w:szCs w:val="20"/>
         </w:rPr>
-        <w:t xml:space="preserve">[T124] Google AI for Developers. Gemini API Additional Terms of Service (use of data on unpaid and paid services). https://ai.google.dev/gemini-api/terms</w:t>
-      </w:r>
-      <w:hyperlink r:id="rId1147" w:history="1"/>
+        <w:t xml:space="preserve">[T124] Google AI for Developers. Gemini API Additional Terms of Service (use of data on unpaid and paid services). </w:t>
+      </w:r>
+      <w:hyperlink r:id="rId15" w:history="1">
+        <w:r>
+          <w:rPr>
+            <w:rStyle w:val="a6"/>
+            <w:sz w:val="20"/>
+            <w:szCs w:val="20"/>
+          </w:rPr>
+          <w:t xml:space="preserve">https://ai.google.dev/gemini-api/terms</w:t>
+        </w:r>
+      </w:hyperlink>
     </w:p>
     <w:p>
       <w:pPr>
@@ -31728,9 +31877,18 @@
           <w:sz w:val="20"/>
           <w:szCs w:val="20"/>
         </w:rPr>
-        <w:t xml:space="preserve">[T125] Google AI for Developers. Gemini Developer API pricing. https://ai.google.dev/gemini-api/docs/pricing</w:t>
-      </w:r>
-      <w:hyperlink r:id="rId1147" w:history="1"/>
+        <w:t xml:space="preserve">[T125] Google AI for Developers. Gemini Developer API pricing. </w:t>
+      </w:r>
+      <w:hyperlink r:id="rId16" w:history="1">
+        <w:r>
+          <w:rPr>
+            <w:rStyle w:val="a6"/>
+            <w:sz w:val="20"/>
+            <w:szCs w:val="20"/>
+          </w:rPr>
+          <w:t xml:space="preserve">https://ai.google.dev/gemini-api/docs/pricing</w:t>
+        </w:r>
+      </w:hyperlink>
     </w:p>
     <w:p>
       <w:pPr>
@@ -31741,9 +31899,18 @@
           <w:sz w:val="20"/>
           <w:szCs w:val="20"/>
         </w:rPr>
-        <w:t xml:space="preserve">[T126] Next.js. Functions: after. https://nextjs.org/docs/app/api-reference/functions/after</w:t>
-      </w:r>
-      <w:hyperlink r:id="rId1147" w:history="1"/>
+        <w:t xml:space="preserve">[T126] Next.js. Functions: after. </w:t>
+      </w:r>
+      <w:hyperlink r:id="rId17" w:history="1">
+        <w:r>
+          <w:rPr>
+            <w:rStyle w:val="a6"/>
+            <w:sz w:val="20"/>
+            <w:szCs w:val="20"/>
+          </w:rPr>
+          <w:t xml:space="preserve">https://nextjs.org/docs/app/api-reference/functions/after</w:t>
+        </w:r>
+      </w:hyperlink>
     </w:p>
     <w:p>
       <w:pPr>
@@ -31754,9 +31921,18 @@
           <w:sz w:val="20"/>
           <w:szCs w:val="20"/>
         </w:rPr>
-        <w:t xml:space="preserve">[T127] GitHub Docs. Events that trigger workflows: schedule. https://docs.github.com/en/actions/writing-workflows/choosing-when-your-workflow-runs/events-that-trigger-workflows#schedule</w:t>
-      </w:r>
-      <w:hyperlink r:id="rId1147" w:history="1"/>
+        <w:t xml:space="preserve">[T127] GitHub Docs. Events that trigger workflows: schedule. </w:t>
+      </w:r>
+      <w:hyperlink r:id="rId18" w:history="1">
+        <w:r>
+          <w:rPr>
+            <w:rStyle w:val="a6"/>
+            <w:sz w:val="20"/>
+            <w:szCs w:val="20"/>
+          </w:rPr>
+          <w:t xml:space="preserve">https://docs.github.com/en/actions/writing-workflows/choosing-when-your-workflow-runs/events-that-trigger-workflows#schedule</w:t>
+        </w:r>
+      </w:hyperlink>
     </w:p>
     <w:p>
       <w:pPr>
@@ -36084,7 +36260,7 @@
                 <w:sz w:val="18"/>
                 <w:szCs w:val="18"/>
               </w:rPr>
-              <w:t xml:space="preserve">OWASP ASVS 5.0 Level 1 checklist; secrets only on the server; ownership check on every resource; signed, expiring URLs for private media; secret scanning in CI</w:t>
+              <w:t xml:space="preserve">OWASP ASVS 5.0 Level 1 checklist; secrets only on the server; ownership check on every resource; private media served only through authorized routes; secret scanning in CI</w:t>
             </w:r>
           </w:p>
         </w:tc>
@@ -36161,7 +36337,7 @@
                 <w:sz w:val="18"/>
                 <w:szCs w:val="18"/>
               </w:rPr>
-              <w:t xml:space="preserve">No names, e-mails or account IDs in AI/TTS requests; provider storage disabled where available; consent before analytics; Law of the RK No. 94-V</w:t>
+              <w:t xml:space="preserve">No names, e-mails or account IDs in AI/TTS requests; provider storage disabled where available; Gemini TTS on the paid tier, where content is not used to improve Google products, before any student content is narrated, and the free tier only with test content [T124]; consent before analytics; Law of the RK No. 94-V</w:t>
             </w:r>
           </w:p>
         </w:tc>
@@ -36809,7 +36985,7 @@
     <w:p>
       <w:pPr/>
       <w:r>
-        <w:t xml:space="preserve">Each mandatory requirement is associated with at least one test case (Section 9.5) and an implementation task in YouTrack.</w:t>
+        <w:t xml:space="preserve">Each mandatory requirement is associated with at least one test case (Section 9.5, column Requirements of Table 9.2) and an implementation task in YouTrack.</w:t>
       </w:r>
     </w:p>
     <w:tbl>
@@ -38732,65 +38908,6 @@
                 <w:szCs w:val="20"/>
               </w:rPr>
               <w:t xml:space="preserve">Triggers the Moodle refresh three times a day and reminders through protected endpoints.</w:t>
-            </w:r>
-          </w:p>
-        </w:tc>
-      </w:tr>
-      <w:tr>
-        <w:trPr>
-          <w:cantSplit/>
-        </w:trPr>
-        <w:tc>
-          <w:tcPr>
-            <w:tcW w:w="2200" w:type="dxa"/>
-          </w:tcPr>
-          <w:p>
-            <w:pPr>
-              <w:spacing w:after="0" w:line="240" w:lineRule="auto"/>
-              <w:jc w:val="left"/>
-            </w:pPr>
-            <w:r>
-              <w:rPr>
-                <w:sz w:val="20"/>
-                <w:szCs w:val="20"/>
-              </w:rPr>
-              <w:t xml:space="preserve">Object storage + CDN</w:t>
-            </w:r>
-          </w:p>
-        </w:tc>
-        <w:tc>
-          <w:tcPr>
-            <w:tcW w:w="1600" w:type="dxa"/>
-          </w:tcPr>
-          <w:p>
-            <w:pPr>
-              <w:spacing w:after="0" w:line="240" w:lineRule="auto"/>
-              <w:jc w:val="left"/>
-            </w:pPr>
-            <w:r>
-              <w:rPr>
-                <w:sz w:val="20"/>
-                <w:szCs w:val="20"/>
-              </w:rPr>
-              <w:t xml:space="preserve">External system</w:t>
-            </w:r>
-          </w:p>
-        </w:tc>
-        <w:tc>
-          <w:tcPr>
-            <w:tcW w:w="5226" w:type="dxa"/>
-          </w:tcPr>
-          <w:p>
-            <w:pPr>
-              <w:spacing w:after="0" w:line="240" w:lineRule="auto"/>
-              <w:jc w:val="left"/>
-            </w:pPr>
-            <w:r>
-              <w:rPr>
-                <w:sz w:val="20"/>
-                <w:szCs w:val="20"/>
-              </w:rPr>
-              <w:t xml:space="preserve">Videos, captions and thumbnails delivered by signed URLs.</w:t>
             </w:r>
           </w:p>
         </w:tc>
@@ -39698,7 +39815,7 @@
     <w:p>
       <w:pPr/>
       <w:r>
-        <w:t xml:space="preserve">The YeahGrind interface is designed mobile-first, because most micro-sessions happen on a phone between classes. The mockups below show the key scenarios with one persona, Aigerim, a second-year student preparing for a Databases quiz on Friday. The visual language is monochrome with color only for state labels; every recommendation shows its reason, every generated item shows its sources and can be reported, and captions are on by default. The clickable prototype is in the repository (prototype/index.html).</w:t>
+        <w:t xml:space="preserve">The YeahGrind interface is designed mobile-first and scales to the laptop: students study in long focused sessions (Section 2.6), while short breaks are used to watch topic videos (I-03) and to check Moodle (I-01), so every screen works from 320 to 1440 px. The mockups below show the key scenarios with one persona, Aigerim, a second-year student preparing for a Databases quiz on Friday. The visual language is monochrome with color only for state labels; every recommendation shows its reason, every generated item shows its sources and can be reported, and captions are on by default. The clickable prototype is in the repository (prototype/index.html).</w:t>
       </w:r>
     </w:p>
     <w:p>
@@ -40324,7 +40441,7 @@
     <w:p>
       <w:pPr/>
       <w:r>
-        <w:t xml:space="preserve">The purpose of the evaluation is to determine whether the platform achieves its aim: a personalized microlearning pathway with generated short videos and adaptive assessment that gives better learning efficiency and good usability compared with a non-adaptive baseline. Particular attention is given to:</w:t>
+        <w:t xml:space="preserve">The purpose of the evaluation is to determine whether the platform achieves its aim: a personalized microlearning pathway with generated short videos and adaptive assessment ; component benchmarks check each part against a threshold, and a pilot learning study estimates its learning gain and usability compared with a non-adaptive baseline. Particular attention is given to:</w:t>
       </w:r>
     </w:p>
     <w:p>
@@ -40461,6 +40578,12 @@
       </w:pPr>
       <w:r>
         <w:t xml:space="preserve">9.3. Evaluation Metrics</w:t>
+      </w:r>
+    </w:p>
+    <w:p>
+      <w:pPr/>
+      <w:r>
+        <w:t xml:space="preserve">The component benchmarks are referred to as B1–B6 in Sections 6 and 10: B1 pathway simulation (9.3.2), B2 assessment model (9.3.3), B3 video pipeline (9.3.4 and 9.3.5), B4 validity of generated content (9.3.6), B5 AI grading (9.3.7) and B6 performance, integrity and accessibility (9.3.8 and test cases TC-23, TC-25, TC-26 and TC-37). The learning and usability study is described in 9.3.1 and Step 4 of Section 9.6.</w:t>
       </w:r>
     </w:p>
     <w:p>
@@ -40494,7 +40617,7 @@
     <w:p>
       <w:pPr/>
       <w:r>
-        <w:t xml:space="preserve">Computed per participant and topic. The target is a higher median gain in the YeahGrind condition than in the baseline condition. A delayed retention score from a test one week later is reported in the same way.</w:t>
+        <w:t xml:space="preserve">Computed per participant and topic. Each participant studies two comparable topics, SQL (LEFT JOIN and GROUP BY) and Python (list comprehensions and dictionaries), one in each condition; the topic–condition pairing and the order of conditions are balanced, so each of the four combinations is used by three participants. With 12 participants the study is a pilot: it estimates the size of the effect rather than proving it. The paired difference in gain (YeahGrind − baseline) is reported with its median, a 95 % bootstrap confidence interval and the effect size r of the Wilcoxon signed-rank test. The target is a median paired difference of at least 0.10 in favor of YeahGrind. The delayed retention score from a test one week later is reported in the same way.</w:t>
       </w:r>
     </w:p>
     <w:p>
@@ -40509,7 +40632,7 @@
           <w:sz w:val="22"/>
           <w:szCs w:val="22"/>
         </w:rPr>
-        <w:t xml:space="preserve">9.3.2. Prerequisite Violations and Budget Overruns</w:t>
+        <w:t xml:space="preserve">9.3.2. Prerequisite Violations and Budget Overruns (B1)</w:t>
       </w:r>
     </w:p>
     <w:p>
@@ -40543,7 +40666,7 @@
           <w:sz w:val="22"/>
           <w:szCs w:val="22"/>
         </w:rPr>
-        <w:t xml:space="preserve">9.3.3. Prediction Accuracy of the Assessment Model</w:t>
+        <w:t xml:space="preserve">9.3.3. Prediction Accuracy of the Assessment Model (B2)</w:t>
       </w:r>
     </w:p>
     <w:p>
@@ -40577,7 +40700,7 @@
           <w:sz w:val="22"/>
           <w:szCs w:val="22"/>
         </w:rPr>
-        <w:t xml:space="preserve">9.3.4. Video Pipeline Reliability, Speed and Cost</w:t>
+        <w:t xml:space="preserve">9.3.4. Video Pipeline Reliability, Speed and Cost (B3)</w:t>
       </w:r>
     </w:p>
     <w:p>
@@ -40611,7 +40734,7 @@
           <w:sz w:val="22"/>
           <w:szCs w:val="22"/>
         </w:rPr>
-        <w:t xml:space="preserve">9.3.5. Seeded-Error Recall</w:t>
+        <w:t xml:space="preserve">9.3.5. Seeded-Error Recall (B3)</w:t>
       </w:r>
     </w:p>
     <w:p>
@@ -40645,7 +40768,7 @@
           <w:sz w:val="22"/>
           <w:szCs w:val="22"/>
         </w:rPr>
-        <w:t xml:space="preserve">9.3.6. Validity of Generated Questions</w:t>
+        <w:t xml:space="preserve">9.3.6. Validity of Generated Questions and Units (B4)</w:t>
       </w:r>
     </w:p>
     <w:p>
@@ -40664,7 +40787,7 @@
     <w:p>
       <w:pPr/>
       <w:r>
-        <w:t xml:space="preserve">One hundred generated questions are rated before moderation; the target is ≥ 85 %, and no invalid item may ever be served.</w:t>
+        <w:t xml:space="preserve">One hundred generated questions are rated before moderation; the target is ≥ 85 %, and no invalid item may ever be served. The same benchmark checks 10 generated skill maps and their units: 100 % acyclic, ≥ 90 % of units within the length limits and ≥ 80 % rated coherent by two raters.</w:t>
       </w:r>
     </w:p>
     <w:p>
@@ -40679,7 +40802,7 @@
           <w:sz w:val="22"/>
           <w:szCs w:val="22"/>
         </w:rPr>
-        <w:t xml:space="preserve">9.3.7. Grading Agreement</w:t>
+        <w:t xml:space="preserve">9.3.7. Grading Agreement (B5)</w:t>
       </w:r>
     </w:p>
     <w:p>
@@ -40713,7 +40836,7 @@
           <w:sz w:val="22"/>
           <w:szCs w:val="22"/>
         </w:rPr>
-        <w:t xml:space="preserve">9.3.8. Usability and Performance</w:t>
+        <w:t xml:space="preserve">9.3.8. Usability and Performance (B6 and the learning study)</w:t>
       </w:r>
     </w:p>
     <w:p>
@@ -40919,7 +41042,7 @@
                 <w:sz w:val="20"/>
                 <w:szCs w:val="20"/>
               </w:rPr>
-              <w:t xml:space="preserve">Same configuration as production on Railway; separate database and storage bucket</w:t>
+              <w:t xml:space="preserve">Same configuration as production on Railway; separate database</w:t>
             </w:r>
           </w:p>
         </w:tc>
@@ -41325,8 +41448,9 @@
       </w:tblPr>
       <w:tblGrid>
         <w:gridCol w:w="900"/>
-        <w:gridCol w:w="3900"/>
-        <w:gridCol w:w="4226"/>
+        <w:gridCol w:w="3250"/>
+        <w:gridCol w:w="3376"/>
+        <w:gridCol w:w="1500"/>
       </w:tblGrid>
       <w:tr>
         <w:trPr>
@@ -41356,7 +41480,7 @@
         </w:tc>
         <w:tc>
           <w:tcPr>
-            <w:tcW w:w="3900" w:type="dxa"/>
+            <w:tcW w:w="3250" w:type="dxa"/>
             <w:shd w:val="clear" w:color="auto" w:fill="F2F2F2"/>
           </w:tcPr>
           <w:p>
@@ -41377,7 +41501,7 @@
         </w:tc>
         <w:tc>
           <w:tcPr>
-            <w:tcW w:w="4226" w:type="dxa"/>
+            <w:tcW w:w="3376" w:type="dxa"/>
             <w:shd w:val="clear" w:color="auto" w:fill="F2F2F2"/>
           </w:tcPr>
           <w:p>
@@ -41393,6 +41517,27 @@
                 <w:szCs w:val="18"/>
               </w:rPr>
               <w:t xml:space="preserve">Expected Result</w:t>
+            </w:r>
+          </w:p>
+        </w:tc>
+        <w:tc>
+          <w:tcPr>
+            <w:tcW w:w="1500" w:type="dxa"/>
+            <w:shd w:val="clear" w:color="auto" w:fill="F2F2F2"/>
+          </w:tcPr>
+          <w:p>
+            <w:pPr>
+              <w:spacing w:after="0" w:line="240" w:lineRule="auto"/>
+              <w:jc w:val="left"/>
+            </w:pPr>
+            <w:r>
+              <w:rPr>
+                <w:b/>
+                <w:bCs/>
+                <w:sz w:val="18"/>
+                <w:szCs w:val="18"/>
+              </w:rPr>
+              <w:t xml:space="preserve">Requirements</w:t>
             </w:r>
           </w:p>
         </w:tc>
@@ -41421,7 +41566,7 @@
         </w:tc>
         <w:tc>
           <w:tcPr>
-            <w:tcW w:w="3900" w:type="dxa"/>
+            <w:tcW w:w="3250" w:type="dxa"/>
           </w:tcPr>
           <w:p>
             <w:pPr>
@@ -41439,7 +41584,7 @@
         </w:tc>
         <w:tc>
           <w:tcPr>
-            <w:tcW w:w="4226" w:type="dxa"/>
+            <w:tcW w:w="3376" w:type="dxa"/>
           </w:tcPr>
           <w:p>
             <w:pPr>
@@ -41452,6 +41597,24 @@
                 <w:szCs w:val="18"/>
               </w:rPr>
               <w:t xml:space="preserve">Sign-in works; access to foreign resources returns 404</w:t>
+            </w:r>
+          </w:p>
+        </w:tc>
+        <w:tc>
+          <w:tcPr>
+            <w:tcW w:w="1500" w:type="dxa"/>
+          </w:tcPr>
+          <w:p>
+            <w:pPr>
+              <w:spacing w:after="0" w:line="240" w:lineRule="auto"/>
+              <w:jc w:val="left"/>
+            </w:pPr>
+            <w:r>
+              <w:rPr>
+                <w:sz w:val="18"/>
+                <w:szCs w:val="18"/>
+              </w:rPr>
+              <w:t xml:space="preserve">FR-01, NFR-05</w:t>
             </w:r>
           </w:p>
         </w:tc>
@@ -41480,7 +41643,7 @@
         </w:tc>
         <w:tc>
           <w:tcPr>
-            <w:tcW w:w="3900" w:type="dxa"/>
+            <w:tcW w:w="3250" w:type="dxa"/>
           </w:tcPr>
           <w:p>
             <w:pPr>
@@ -41498,7 +41661,7 @@
         </w:tc>
         <w:tc>
           <w:tcPr>
-            <w:tcW w:w="4226" w:type="dxa"/>
+            <w:tcW w:w="3376" w:type="dxa"/>
           </w:tcPr>
           <w:p>
             <w:pPr>
@@ -41511,6 +41674,24 @@
                 <w:szCs w:val="18"/>
               </w:rPr>
               <w:t xml:space="preserve">Rejected; AITU accounts accepted</w:t>
+            </w:r>
+          </w:p>
+        </w:tc>
+        <w:tc>
+          <w:tcPr>
+            <w:tcW w:w="1500" w:type="dxa"/>
+          </w:tcPr>
+          <w:p>
+            <w:pPr>
+              <w:spacing w:after="0" w:line="240" w:lineRule="auto"/>
+              <w:jc w:val="left"/>
+            </w:pPr>
+            <w:r>
+              <w:rPr>
+                <w:sz w:val="18"/>
+                <w:szCs w:val="18"/>
+              </w:rPr>
+              <w:t xml:space="preserve">FR-02</w:t>
             </w:r>
           </w:p>
         </w:tc>
@@ -41539,7 +41720,7 @@
         </w:tc>
         <w:tc>
           <w:tcPr>
-            <w:tcW w:w="3900" w:type="dxa"/>
+            <w:tcW w:w="3250" w:type="dxa"/>
           </w:tcPr>
           <w:p>
             <w:pPr>
@@ -41557,7 +41738,7 @@
         </w:tc>
         <w:tc>
           <w:tcPr>
-            <w:tcW w:w="4226" w:type="dxa"/>
+            <w:tcW w:w="3376" w:type="dxa"/>
           </w:tcPr>
           <w:p>
             <w:pPr>
@@ -41570,6 +41751,24 @@
                 <w:szCs w:val="18"/>
               </w:rPr>
               <w:t xml:space="preserve">No analytics event stored; progress stored</w:t>
+            </w:r>
+          </w:p>
+        </w:tc>
+        <w:tc>
+          <w:tcPr>
+            <w:tcW w:w="1500" w:type="dxa"/>
+          </w:tcPr>
+          <w:p>
+            <w:pPr>
+              <w:spacing w:after="0" w:line="240" w:lineRule="auto"/>
+              <w:jc w:val="left"/>
+            </w:pPr>
+            <w:r>
+              <w:rPr>
+                <w:sz w:val="18"/>
+                <w:szCs w:val="18"/>
+              </w:rPr>
+              <w:t xml:space="preserve">FR-03, NFR-06</w:t>
             </w:r>
           </w:p>
         </w:tc>
@@ -41598,7 +41797,7 @@
         </w:tc>
         <w:tc>
           <w:tcPr>
-            <w:tcW w:w="3900" w:type="dxa"/>
+            <w:tcW w:w="3250" w:type="dxa"/>
           </w:tcPr>
           <w:p>
             <w:pPr>
@@ -41616,7 +41815,7 @@
         </w:tc>
         <w:tc>
           <w:tcPr>
-            <w:tcW w:w="4226" w:type="dxa"/>
+            <w:tcW w:w="3376" w:type="dxa"/>
           </w:tcPr>
           <w:p>
             <w:pPr>
@@ -41629,6 +41828,24 @@
                 <w:szCs w:val="18"/>
               </w:rPr>
               <w:t xml:space="preserve">No user-owned row or private media object remains</w:t>
+            </w:r>
+          </w:p>
+        </w:tc>
+        <w:tc>
+          <w:tcPr>
+            <w:tcW w:w="1500" w:type="dxa"/>
+          </w:tcPr>
+          <w:p>
+            <w:pPr>
+              <w:spacing w:after="0" w:line="240" w:lineRule="auto"/>
+              <w:jc w:val="left"/>
+            </w:pPr>
+            <w:r>
+              <w:rPr>
+                <w:sz w:val="18"/>
+                <w:szCs w:val="18"/>
+              </w:rPr>
+              <w:t xml:space="preserve">FR-04</w:t>
             </w:r>
           </w:p>
         </w:tc>
@@ -41657,7 +41874,7 @@
         </w:tc>
         <w:tc>
           <w:tcPr>
-            <w:tcW w:w="3900" w:type="dxa"/>
+            <w:tcW w:w="3250" w:type="dxa"/>
           </w:tcPr>
           <w:p>
             <w:pPr>
@@ -41675,7 +41892,7 @@
         </w:tc>
         <w:tc>
           <w:tcPr>
-            <w:tcW w:w="4226" w:type="dxa"/>
+            <w:tcW w:w="3376" w:type="dxa"/>
           </w:tcPr>
           <w:p>
             <w:pPr>
@@ -41687,7 +41904,25 @@
                 <w:sz w:val="18"/>
                 <w:szCs w:val="18"/>
               </w:rPr>
-              <w:t xml:space="preserve">Material treated as data; skill map valid and acyclic</w:t>
+              <w:t xml:space="preserve">Material treated as data; skill map valid and acyclic; every unit has one objective and takes 2–5 min</w:t>
+            </w:r>
+          </w:p>
+        </w:tc>
+        <w:tc>
+          <w:tcPr>
+            <w:tcW w:w="1500" w:type="dxa"/>
+          </w:tcPr>
+          <w:p>
+            <w:pPr>
+              <w:spacing w:after="0" w:line="240" w:lineRule="auto"/>
+              <w:jc w:val="left"/>
+            </w:pPr>
+            <w:r>
+              <w:rPr>
+                <w:sz w:val="18"/>
+                <w:szCs w:val="18"/>
+              </w:rPr>
+              <w:t xml:space="preserve">FR-06, FR-08, FR-09</w:t>
             </w:r>
           </w:p>
         </w:tc>
@@ -41716,7 +41951,7 @@
         </w:tc>
         <w:tc>
           <w:tcPr>
-            <w:tcW w:w="3900" w:type="dxa"/>
+            <w:tcW w:w="3250" w:type="dxa"/>
           </w:tcPr>
           <w:p>
             <w:pPr>
@@ -41734,7 +41969,7 @@
         </w:tc>
         <w:tc>
           <w:tcPr>
-            <w:tcW w:w="4226" w:type="dxa"/>
+            <w:tcW w:w="3376" w:type="dxa"/>
           </w:tcPr>
           <w:p>
             <w:pPr>
@@ -41747,6 +41982,24 @@
                 <w:szCs w:val="18"/>
               </w:rPr>
               <w:t xml:space="preserve">No unit of a locked skill is planned</w:t>
+            </w:r>
+          </w:p>
+        </w:tc>
+        <w:tc>
+          <w:tcPr>
+            <w:tcW w:w="1500" w:type="dxa"/>
+          </w:tcPr>
+          <w:p>
+            <w:pPr>
+              <w:spacing w:after="0" w:line="240" w:lineRule="auto"/>
+              <w:jc w:val="left"/>
+            </w:pPr>
+            <w:r>
+              <w:rPr>
+                <w:sz w:val="18"/>
+                <w:szCs w:val="18"/>
+              </w:rPr>
+              <w:t xml:space="preserve">FR-11</w:t>
             </w:r>
           </w:p>
         </w:tc>
@@ -41775,7 +42028,7 @@
         </w:tc>
         <w:tc>
           <w:tcPr>
-            <w:tcW w:w="3900" w:type="dxa"/>
+            <w:tcW w:w="3250" w:type="dxa"/>
           </w:tcPr>
           <w:p>
             <w:pPr>
@@ -41793,7 +42046,7 @@
         </w:tc>
         <w:tc>
           <w:tcPr>
-            <w:tcW w:w="4226" w:type="dxa"/>
+            <w:tcW w:w="3376" w:type="dxa"/>
           </w:tcPr>
           <w:p>
             <w:pPr>
@@ -41806,6 +42059,24 @@
                 <w:szCs w:val="18"/>
               </w:rPr>
               <w:t xml:space="preserve">Planned time ≤ 40 min; every item has a reason</w:t>
+            </w:r>
+          </w:p>
+        </w:tc>
+        <w:tc>
+          <w:tcPr>
+            <w:tcW w:w="1500" w:type="dxa"/>
+          </w:tcPr>
+          <w:p>
+            <w:pPr>
+              <w:spacing w:after="0" w:line="240" w:lineRule="auto"/>
+              <w:jc w:val="left"/>
+            </w:pPr>
+            <w:r>
+              <w:rPr>
+                <w:sz w:val="18"/>
+                <w:szCs w:val="18"/>
+              </w:rPr>
+              <w:t xml:space="preserve">FR-12, FR-13</w:t>
             </w:r>
           </w:p>
         </w:tc>
@@ -41834,7 +42105,7 @@
         </w:tc>
         <w:tc>
           <w:tcPr>
-            <w:tcW w:w="3900" w:type="dxa"/>
+            <w:tcW w:w="3250" w:type="dxa"/>
           </w:tcPr>
           <w:p>
             <w:pPr>
@@ -41852,7 +42123,7 @@
         </w:tc>
         <w:tc>
           <w:tcPr>
-            <w:tcW w:w="4226" w:type="dxa"/>
+            <w:tcW w:w="3376" w:type="dxa"/>
           </w:tcPr>
           <w:p>
             <w:pPr>
@@ -41865,6 +42136,24 @@
                 <w:szCs w:val="18"/>
               </w:rPr>
               <w:t xml:space="preserve">Review item included in today's plan</w:t>
+            </w:r>
+          </w:p>
+        </w:tc>
+        <w:tc>
+          <w:tcPr>
+            <w:tcW w:w="1500" w:type="dxa"/>
+          </w:tcPr>
+          <w:p>
+            <w:pPr>
+              <w:spacing w:after="0" w:line="240" w:lineRule="auto"/>
+              <w:jc w:val="left"/>
+            </w:pPr>
+            <w:r>
+              <w:rPr>
+                <w:sz w:val="18"/>
+                <w:szCs w:val="18"/>
+              </w:rPr>
+              <w:t xml:space="preserve">FR-15</w:t>
             </w:r>
           </w:p>
         </w:tc>
@@ -41893,7 +42182,7 @@
         </w:tc>
         <w:tc>
           <w:tcPr>
-            <w:tcW w:w="3900" w:type="dxa"/>
+            <w:tcW w:w="3250" w:type="dxa"/>
           </w:tcPr>
           <w:p>
             <w:pPr>
@@ -41911,7 +42200,7 @@
         </w:tc>
         <w:tc>
           <w:tcPr>
-            <w:tcW w:w="4226" w:type="dxa"/>
+            <w:tcW w:w="3376" w:type="dxa"/>
           </w:tcPr>
           <w:p>
             <w:pPr>
@@ -41924,6 +42213,24 @@
                 <w:szCs w:val="18"/>
               </w:rPr>
               <w:t xml:space="preserve">Deadlines and course names imported; changed and canceled events updated; URL never returned</w:t>
+            </w:r>
+          </w:p>
+        </w:tc>
+        <w:tc>
+          <w:tcPr>
+            <w:tcW w:w="1500" w:type="dxa"/>
+          </w:tcPr>
+          <w:p>
+            <w:pPr>
+              <w:spacing w:after="0" w:line="240" w:lineRule="auto"/>
+              <w:jc w:val="left"/>
+            </w:pPr>
+            <w:r>
+              <w:rPr>
+                <w:sz w:val="18"/>
+                <w:szCs w:val="18"/>
+              </w:rPr>
+              <w:t xml:space="preserve">FR-16, FR-17</w:t>
             </w:r>
           </w:p>
         </w:tc>
@@ -41952,7 +42259,7 @@
         </w:tc>
         <w:tc>
           <w:tcPr>
-            <w:tcW w:w="3900" w:type="dxa"/>
+            <w:tcW w:w="3250" w:type="dxa"/>
           </w:tcPr>
           <w:p>
             <w:pPr>
@@ -41970,7 +42277,7 @@
         </w:tc>
         <w:tc>
           <w:tcPr>
-            <w:tcW w:w="4226" w:type="dxa"/>
+            <w:tcW w:w="3376" w:type="dxa"/>
           </w:tcPr>
           <w:p>
             <w:pPr>
@@ -41983,6 +42290,24 @@
                 <w:szCs w:val="18"/>
               </w:rPr>
               <w:t xml:space="preserve">Status 202; job runs; narration 60–120 s with WebVTT; player exports MP4 or WebM</w:t>
+            </w:r>
+          </w:p>
+        </w:tc>
+        <w:tc>
+          <w:tcPr>
+            <w:tcW w:w="1500" w:type="dxa"/>
+          </w:tcPr>
+          <w:p>
+            <w:pPr>
+              <w:spacing w:after="0" w:line="240" w:lineRule="auto"/>
+              <w:jc w:val="left"/>
+            </w:pPr>
+            <w:r>
+              <w:rPr>
+                <w:sz w:val="18"/>
+                <w:szCs w:val="18"/>
+              </w:rPr>
+              <w:t xml:space="preserve">FR-19, FR-20</w:t>
             </w:r>
           </w:p>
         </w:tc>
@@ -42011,7 +42336,7 @@
         </w:tc>
         <w:tc>
           <w:tcPr>
-            <w:tcW w:w="3900" w:type="dxa"/>
+            <w:tcW w:w="3250" w:type="dxa"/>
           </w:tcPr>
           <w:p>
             <w:pPr>
@@ -42029,7 +42354,7 @@
         </w:tc>
         <w:tc>
           <w:tcPr>
-            <w:tcW w:w="4226" w:type="dxa"/>
+            <w:tcW w:w="3376" w:type="dxa"/>
           </w:tcPr>
           <w:p>
             <w:pPr>
@@ -42042,6 +42367,24 @@
                 <w:szCs w:val="18"/>
               </w:rPr>
               <w:t xml:space="preserve">Status 200; no new LLM or TTS call</w:t>
+            </w:r>
+          </w:p>
+        </w:tc>
+        <w:tc>
+          <w:tcPr>
+            <w:tcW w:w="1500" w:type="dxa"/>
+          </w:tcPr>
+          <w:p>
+            <w:pPr>
+              <w:spacing w:after="0" w:line="240" w:lineRule="auto"/>
+              <w:jc w:val="left"/>
+            </w:pPr>
+            <w:r>
+              <w:rPr>
+                <w:sz w:val="18"/>
+                <w:szCs w:val="18"/>
+              </w:rPr>
+              <w:t xml:space="preserve">FR-22</w:t>
             </w:r>
           </w:p>
         </w:tc>
@@ -42070,7 +42413,7 @@
         </w:tc>
         <w:tc>
           <w:tcPr>
-            <w:tcW w:w="3900" w:type="dxa"/>
+            <w:tcW w:w="3250" w:type="dxa"/>
           </w:tcPr>
           <w:p>
             <w:pPr>
@@ -42088,7 +42431,7 @@
         </w:tc>
         <w:tc>
           <w:tcPr>
-            <w:tcW w:w="4226" w:type="dxa"/>
+            <w:tcW w:w="3376" w:type="dxa"/>
           </w:tcPr>
           <w:p>
             <w:pPr>
@@ -42101,6 +42444,24 @@
                 <w:szCs w:val="18"/>
               </w:rPr>
               <w:t xml:space="preserve">Status needs_review; not visible to students; listed in moderation queue</w:t>
+            </w:r>
+          </w:p>
+        </w:tc>
+        <w:tc>
+          <w:tcPr>
+            <w:tcW w:w="1500" w:type="dxa"/>
+          </w:tcPr>
+          <w:p>
+            <w:pPr>
+              <w:spacing w:after="0" w:line="240" w:lineRule="auto"/>
+              <w:jc w:val="left"/>
+            </w:pPr>
+            <w:r>
+              <w:rPr>
+                <w:sz w:val="18"/>
+                <w:szCs w:val="18"/>
+              </w:rPr>
+              <w:t xml:space="preserve">FR-21, FR-36</w:t>
             </w:r>
           </w:p>
         </w:tc>
@@ -42129,7 +42490,7 @@
         </w:tc>
         <w:tc>
           <w:tcPr>
-            <w:tcW w:w="3900" w:type="dxa"/>
+            <w:tcW w:w="3250" w:type="dxa"/>
           </w:tcPr>
           <w:p>
             <w:pPr>
@@ -42147,7 +42508,7 @@
         </w:tc>
         <w:tc>
           <w:tcPr>
-            <w:tcW w:w="4226" w:type="dxa"/>
+            <w:tcW w:w="3376" w:type="dxa"/>
           </w:tcPr>
           <w:p>
             <w:pPr>
@@ -42160,6 +42521,24 @@
                 <w:szCs w:val="18"/>
               </w:rPr>
               <w:t xml:space="preserve">Retried up to 3 times, then failed with a message; no fake output</w:t>
+            </w:r>
+          </w:p>
+        </w:tc>
+        <w:tc>
+          <w:tcPr>
+            <w:tcW w:w="1500" w:type="dxa"/>
+          </w:tcPr>
+          <w:p>
+            <w:pPr>
+              <w:spacing w:after="0" w:line="240" w:lineRule="auto"/>
+              <w:jc w:val="left"/>
+            </w:pPr>
+            <w:r>
+              <w:rPr>
+                <w:sz w:val="18"/>
+                <w:szCs w:val="18"/>
+              </w:rPr>
+              <w:t xml:space="preserve">FR-20, NFR-11</w:t>
             </w:r>
           </w:p>
         </w:tc>
@@ -42188,7 +42567,7 @@
         </w:tc>
         <w:tc>
           <w:tcPr>
-            <w:tcW w:w="3900" w:type="dxa"/>
+            <w:tcW w:w="3250" w:type="dxa"/>
           </w:tcPr>
           <w:p>
             <w:pPr>
@@ -42206,7 +42585,7 @@
         </w:tc>
         <w:tc>
           <w:tcPr>
-            <w:tcW w:w="4226" w:type="dxa"/>
+            <w:tcW w:w="3376" w:type="dxa"/>
           </w:tcPr>
           <w:p>
             <w:pPr>
@@ -42219,6 +42598,24 @@
                 <w:szCs w:val="18"/>
               </w:rPr>
               <w:t xml:space="preserve">Status 409</w:t>
+            </w:r>
+          </w:p>
+        </w:tc>
+        <w:tc>
+          <w:tcPr>
+            <w:tcW w:w="1500" w:type="dxa"/>
+          </w:tcPr>
+          <w:p>
+            <w:pPr>
+              <w:spacing w:after="0" w:line="240" w:lineRule="auto"/>
+              <w:jc w:val="left"/>
+            </w:pPr>
+            <w:r>
+              <w:rPr>
+                <w:sz w:val="18"/>
+                <w:szCs w:val="18"/>
+              </w:rPr>
+              <w:t xml:space="preserve">FR-23</w:t>
             </w:r>
           </w:p>
         </w:tc>
@@ -42247,7 +42644,7 @@
         </w:tc>
         <w:tc>
           <w:tcPr>
-            <w:tcW w:w="3900" w:type="dxa"/>
+            <w:tcW w:w="3250" w:type="dxa"/>
           </w:tcPr>
           <w:p>
             <w:pPr>
@@ -42265,7 +42662,7 @@
         </w:tc>
         <w:tc>
           <w:tcPr>
-            <w:tcW w:w="4226" w:type="dxa"/>
+            <w:tcW w:w="3376" w:type="dxa"/>
           </w:tcPr>
           <w:p>
             <w:pPr>
@@ -42278,6 +42675,24 @@
                 <w:szCs w:val="18"/>
               </w:rPr>
               <w:t xml:space="preserve">Item with P closest to 0.7; no repeats; ≤ 500 ms</w:t>
+            </w:r>
+          </w:p>
+        </w:tc>
+        <w:tc>
+          <w:tcPr>
+            <w:tcW w:w="1500" w:type="dxa"/>
+          </w:tcPr>
+          <w:p>
+            <w:pPr>
+              <w:spacing w:after="0" w:line="240" w:lineRule="auto"/>
+              <w:jc w:val="left"/>
+            </w:pPr>
+            <w:r>
+              <w:rPr>
+                <w:sz w:val="18"/>
+                <w:szCs w:val="18"/>
+              </w:rPr>
+              <w:t xml:space="preserve">FR-26, NFR-02</w:t>
             </w:r>
           </w:p>
         </w:tc>
@@ -42306,7 +42721,7 @@
         </w:tc>
         <w:tc>
           <w:tcPr>
-            <w:tcW w:w="3900" w:type="dxa"/>
+            <w:tcW w:w="3250" w:type="dxa"/>
           </w:tcPr>
           <w:p>
             <w:pPr>
@@ -42324,7 +42739,7 @@
         </w:tc>
         <w:tc>
           <w:tcPr>
-            <w:tcW w:w="4226" w:type="dxa"/>
+            <w:tcW w:w="3376" w:type="dxa"/>
           </w:tcPr>
           <w:p>
             <w:pPr>
@@ -42337,6 +42752,24 @@
                 <w:szCs w:val="18"/>
               </w:rPr>
               <w:t xml:space="preserve">Ability and mastery move in the expected direction</w:t>
+            </w:r>
+          </w:p>
+        </w:tc>
+        <w:tc>
+          <w:tcPr>
+            <w:tcW w:w="1500" w:type="dxa"/>
+          </w:tcPr>
+          <w:p>
+            <w:pPr>
+              <w:spacing w:after="0" w:line="240" w:lineRule="auto"/>
+              <w:jc w:val="left"/>
+            </w:pPr>
+            <w:r>
+              <w:rPr>
+                <w:sz w:val="18"/>
+                <w:szCs w:val="18"/>
+              </w:rPr>
+              <w:t xml:space="preserve">FR-27</w:t>
             </w:r>
           </w:p>
         </w:tc>
@@ -42365,7 +42798,7 @@
         </w:tc>
         <w:tc>
           <w:tcPr>
-            <w:tcW w:w="3900" w:type="dxa"/>
+            <w:tcW w:w="3250" w:type="dxa"/>
           </w:tcPr>
           <w:p>
             <w:pPr>
@@ -42383,7 +42816,7 @@
         </w:tc>
         <w:tc>
           <w:tcPr>
-            <w:tcW w:w="4226" w:type="dxa"/>
+            <w:tcW w:w="3376" w:type="dxa"/>
           </w:tcPr>
           <w:p>
             <w:pPr>
@@ -42396,6 +42829,24 @@
                 <w:szCs w:val="18"/>
               </w:rPr>
               <w:t xml:space="preserve">Stored result returned; no second update or reward</w:t>
+            </w:r>
+          </w:p>
+        </w:tc>
+        <w:tc>
+          <w:tcPr>
+            <w:tcW w:w="1500" w:type="dxa"/>
+          </w:tcPr>
+          <w:p>
+            <w:pPr>
+              <w:spacing w:after="0" w:line="240" w:lineRule="auto"/>
+              <w:jc w:val="left"/>
+            </w:pPr>
+            <w:r>
+              <w:rPr>
+                <w:sz w:val="18"/>
+                <w:szCs w:val="18"/>
+              </w:rPr>
+              <w:t xml:space="preserve">FR-27, NFR-07</w:t>
             </w:r>
           </w:p>
         </w:tc>
@@ -42424,7 +42875,7 @@
         </w:tc>
         <w:tc>
           <w:tcPr>
-            <w:tcW w:w="3900" w:type="dxa"/>
+            <w:tcW w:w="3250" w:type="dxa"/>
           </w:tcPr>
           <w:p>
             <w:pPr>
@@ -42442,7 +42893,7 @@
         </w:tc>
         <w:tc>
           <w:tcPr>
-            <w:tcW w:w="4226" w:type="dxa"/>
+            <w:tcW w:w="3376" w:type="dxa"/>
           </w:tcPr>
           <w:p>
             <w:pPr>
@@ -42455,6 +42906,24 @@
                 <w:szCs w:val="18"/>
               </w:rPr>
               <w:t xml:space="preserve">No response contains the answer key or rubric</w:t>
+            </w:r>
+          </w:p>
+        </w:tc>
+        <w:tc>
+          <w:tcPr>
+            <w:tcW w:w="1500" w:type="dxa"/>
+          </w:tcPr>
+          <w:p>
+            <w:pPr>
+              <w:spacing w:after="0" w:line="240" w:lineRule="auto"/>
+              <w:jc w:val="left"/>
+            </w:pPr>
+            <w:r>
+              <w:rPr>
+                <w:sz w:val="18"/>
+                <w:szCs w:val="18"/>
+              </w:rPr>
+              <w:t xml:space="preserve">FR-29</w:t>
             </w:r>
           </w:p>
         </w:tc>
@@ -42483,7 +42952,7 @@
         </w:tc>
         <w:tc>
           <w:tcPr>
-            <w:tcW w:w="3900" w:type="dxa"/>
+            <w:tcW w:w="3250" w:type="dxa"/>
           </w:tcPr>
           <w:p>
             <w:pPr>
@@ -42501,7 +42970,7 @@
         </w:tc>
         <w:tc>
           <w:tcPr>
-            <w:tcW w:w="4226" w:type="dxa"/>
+            <w:tcW w:w="3376" w:type="dxa"/>
           </w:tcPr>
           <w:p>
             <w:pPr>
@@ -42514,6 +42983,24 @@
                 <w:szCs w:val="18"/>
               </w:rPr>
               <w:t xml:space="preserve">Graded by the rubric; injection has no effect</w:t>
+            </w:r>
+          </w:p>
+        </w:tc>
+        <w:tc>
+          <w:tcPr>
+            <w:tcW w:w="1500" w:type="dxa"/>
+          </w:tcPr>
+          <w:p>
+            <w:pPr>
+              <w:spacing w:after="0" w:line="240" w:lineRule="auto"/>
+              <w:jc w:val="left"/>
+            </w:pPr>
+            <w:r>
+              <w:rPr>
+                <w:sz w:val="18"/>
+                <w:szCs w:val="18"/>
+              </w:rPr>
+              <w:t xml:space="preserve">FR-28</w:t>
             </w:r>
           </w:p>
         </w:tc>
@@ -42542,7 +43029,7 @@
         </w:tc>
         <w:tc>
           <w:tcPr>
-            <w:tcW w:w="3900" w:type="dxa"/>
+            <w:tcW w:w="3250" w:type="dxa"/>
           </w:tcPr>
           <w:p>
             <w:pPr>
@@ -42560,7 +43047,7 @@
         </w:tc>
         <w:tc>
           <w:tcPr>
-            <w:tcW w:w="4226" w:type="dxa"/>
+            <w:tcW w:w="3376" w:type="dxa"/>
           </w:tcPr>
           <w:p>
             <w:pPr>
@@ -42573,6 +43060,24 @@
                 <w:szCs w:val="18"/>
               </w:rPr>
               <w:t xml:space="preserve">Only permitted events shown; scores private</w:t>
+            </w:r>
+          </w:p>
+        </w:tc>
+        <w:tc>
+          <w:tcPr>
+            <w:tcW w:w="1500" w:type="dxa"/>
+          </w:tcPr>
+          <w:p>
+            <w:pPr>
+              <w:spacing w:after="0" w:line="240" w:lineRule="auto"/>
+              <w:jc w:val="left"/>
+            </w:pPr>
+            <w:r>
+              <w:rPr>
+                <w:sz w:val="18"/>
+                <w:szCs w:val="18"/>
+              </w:rPr>
+              <w:t xml:space="preserve">FR-32</w:t>
             </w:r>
           </w:p>
         </w:tc>
@@ -42601,7 +43106,7 @@
         </w:tc>
         <w:tc>
           <w:tcPr>
-            <w:tcW w:w="3900" w:type="dxa"/>
+            <w:tcW w:w="3250" w:type="dxa"/>
           </w:tcPr>
           <w:p>
             <w:pPr>
@@ -42619,7 +43124,7 @@
         </w:tc>
         <w:tc>
           <w:tcPr>
-            <w:tcW w:w="4226" w:type="dxa"/>
+            <w:tcW w:w="3376" w:type="dxa"/>
           </w:tcPr>
           <w:p>
             <w:pPr>
@@ -42632,6 +43137,24 @@
                 <w:szCs w:val="18"/>
               </w:rPr>
               <w:t xml:space="preserve">Group total shown; no member ranking by default</w:t>
+            </w:r>
+          </w:p>
+        </w:tc>
+        <w:tc>
+          <w:tcPr>
+            <w:tcW w:w="1500" w:type="dxa"/>
+          </w:tcPr>
+          <w:p>
+            <w:pPr>
+              <w:spacing w:after="0" w:line="240" w:lineRule="auto"/>
+              <w:jc w:val="left"/>
+            </w:pPr>
+            <w:r>
+              <w:rPr>
+                <w:sz w:val="18"/>
+                <w:szCs w:val="18"/>
+              </w:rPr>
+              <w:t xml:space="preserve">FR-34</w:t>
             </w:r>
           </w:p>
         </w:tc>
@@ -42660,7 +43183,7 @@
         </w:tc>
         <w:tc>
           <w:tcPr>
-            <w:tcW w:w="3900" w:type="dxa"/>
+            <w:tcW w:w="3250" w:type="dxa"/>
           </w:tcPr>
           <w:p>
             <w:pPr>
@@ -42678,7 +43201,7 @@
         </w:tc>
         <w:tc>
           <w:tcPr>
-            <w:tcW w:w="4226" w:type="dxa"/>
+            <w:tcW w:w="3376" w:type="dxa"/>
           </w:tcPr>
           <w:p>
             <w:pPr>
@@ -42691,6 +43214,24 @@
                 <w:szCs w:val="18"/>
               </w:rPr>
               <w:t xml:space="preserve">Question never served again; action logged</w:t>
+            </w:r>
+          </w:p>
+        </w:tc>
+        <w:tc>
+          <w:tcPr>
+            <w:tcW w:w="1500" w:type="dxa"/>
+          </w:tcPr>
+          <w:p>
+            <w:pPr>
+              <w:spacing w:after="0" w:line="240" w:lineRule="auto"/>
+              <w:jc w:val="left"/>
+            </w:pPr>
+            <w:r>
+              <w:rPr>
+                <w:sz w:val="18"/>
+                <w:szCs w:val="18"/>
+              </w:rPr>
+              <w:t xml:space="preserve">FR-36</w:t>
             </w:r>
           </w:p>
         </w:tc>
@@ -42719,7 +43260,7 @@
         </w:tc>
         <w:tc>
           <w:tcPr>
-            <w:tcW w:w="3900" w:type="dxa"/>
+            <w:tcW w:w="3250" w:type="dxa"/>
           </w:tcPr>
           <w:p>
             <w:pPr>
@@ -42737,7 +43278,7 @@
         </w:tc>
         <w:tc>
           <w:tcPr>
-            <w:tcW w:w="4226" w:type="dxa"/>
+            <w:tcW w:w="3376" w:type="dxa"/>
           </w:tcPr>
           <w:p>
             <w:pPr>
@@ -42750,6 +43291,24 @@
                 <w:szCs w:val="18"/>
               </w:rPr>
               <w:t xml:space="preserve">Exactly one reward; no negative balance</w:t>
+            </w:r>
+          </w:p>
+        </w:tc>
+        <w:tc>
+          <w:tcPr>
+            <w:tcW w:w="1500" w:type="dxa"/>
+          </w:tcPr>
+          <w:p>
+            <w:pPr>
+              <w:spacing w:after="0" w:line="240" w:lineRule="auto"/>
+              <w:jc w:val="left"/>
+            </w:pPr>
+            <w:r>
+              <w:rPr>
+                <w:sz w:val="18"/>
+                <w:szCs w:val="18"/>
+              </w:rPr>
+              <w:t xml:space="preserve">FR-37, NFR-07</w:t>
             </w:r>
           </w:p>
         </w:tc>
@@ -42778,7 +43337,7 @@
         </w:tc>
         <w:tc>
           <w:tcPr>
-            <w:tcW w:w="3900" w:type="dxa"/>
+            <w:tcW w:w="3250" w:type="dxa"/>
           </w:tcPr>
           <w:p>
             <w:pPr>
@@ -42796,7 +43355,7 @@
         </w:tc>
         <w:tc>
           <w:tcPr>
-            <w:tcW w:w="4226" w:type="dxa"/>
+            <w:tcW w:w="3376" w:type="dxa"/>
           </w:tcPr>
           <w:p>
             <w:pPr>
@@ -42809,6 +43368,24 @@
                 <w:szCs w:val="18"/>
               </w:rPr>
               <w:t xml:space="preserve">Not sent; delivered after quiet hours</w:t>
+            </w:r>
+          </w:p>
+        </w:tc>
+        <w:tc>
+          <w:tcPr>
+            <w:tcW w:w="1500" w:type="dxa"/>
+          </w:tcPr>
+          <w:p>
+            <w:pPr>
+              <w:spacing w:after="0" w:line="240" w:lineRule="auto"/>
+              <w:jc w:val="left"/>
+            </w:pPr>
+            <w:r>
+              <w:rPr>
+                <w:sz w:val="18"/>
+                <w:szCs w:val="18"/>
+              </w:rPr>
+              <w:t xml:space="preserve">FR-39</w:t>
             </w:r>
           </w:p>
         </w:tc>
@@ -42837,7 +43414,7 @@
         </w:tc>
         <w:tc>
           <w:tcPr>
-            <w:tcW w:w="3900" w:type="dxa"/>
+            <w:tcW w:w="3250" w:type="dxa"/>
           </w:tcPr>
           <w:p>
             <w:pPr>
@@ -42855,7 +43432,7 @@
         </w:tc>
         <w:tc>
           <w:tcPr>
-            <w:tcW w:w="4226" w:type="dxa"/>
+            <w:tcW w:w="3376" w:type="dxa"/>
           </w:tcPr>
           <w:p>
             <w:pPr>
@@ -42868,6 +43445,24 @@
                 <w:szCs w:val="18"/>
               </w:rPr>
               <w:t xml:space="preserve">p95 ≤ 500 ms; error rate &lt; 1 %</w:t>
+            </w:r>
+          </w:p>
+        </w:tc>
+        <w:tc>
+          <w:tcPr>
+            <w:tcW w:w="1500" w:type="dxa"/>
+          </w:tcPr>
+          <w:p>
+            <w:pPr>
+              <w:spacing w:after="0" w:line="240" w:lineRule="auto"/>
+              <w:jc w:val="left"/>
+            </w:pPr>
+            <w:r>
+              <w:rPr>
+                <w:sz w:val="18"/>
+                <w:szCs w:val="18"/>
+              </w:rPr>
+              <w:t xml:space="preserve">NFR-01</w:t>
             </w:r>
           </w:p>
         </w:tc>
@@ -42896,7 +43491,7 @@
         </w:tc>
         <w:tc>
           <w:tcPr>
-            <w:tcW w:w="3900" w:type="dxa"/>
+            <w:tcW w:w="3250" w:type="dxa"/>
           </w:tcPr>
           <w:p>
             <w:pPr>
@@ -42914,7 +43509,7 @@
         </w:tc>
         <w:tc>
           <w:tcPr>
-            <w:tcW w:w="4226" w:type="dxa"/>
+            <w:tcW w:w="3376" w:type="dxa"/>
           </w:tcPr>
           <w:p>
             <w:pPr>
@@ -42927,6 +43522,24 @@
                 <w:szCs w:val="18"/>
               </w:rPr>
               <w:t xml:space="preserve">Zero critical or serious axe-core violations</w:t>
+            </w:r>
+          </w:p>
+        </w:tc>
+        <w:tc>
+          <w:tcPr>
+            <w:tcW w:w="1500" w:type="dxa"/>
+          </w:tcPr>
+          <w:p>
+            <w:pPr>
+              <w:spacing w:after="0" w:line="240" w:lineRule="auto"/>
+              <w:jc w:val="left"/>
+            </w:pPr>
+            <w:r>
+              <w:rPr>
+                <w:sz w:val="18"/>
+                <w:szCs w:val="18"/>
+              </w:rPr>
+              <w:t xml:space="preserve">NFR-09</w:t>
             </w:r>
           </w:p>
         </w:tc>
@@ -42955,7 +43568,7 @@
         </w:tc>
         <w:tc>
           <w:tcPr>
-            <w:tcW w:w="3900" w:type="dxa"/>
+            <w:tcW w:w="3250" w:type="dxa"/>
           </w:tcPr>
           <w:p>
             <w:pPr>
@@ -42973,7 +43586,7 @@
         </w:tc>
         <w:tc>
           <w:tcPr>
-            <w:tcW w:w="4226" w:type="dxa"/>
+            <w:tcW w:w="3376" w:type="dxa"/>
           </w:tcPr>
           <w:p>
             <w:pPr>
@@ -42986,6 +43599,794 @@
                 <w:szCs w:val="18"/>
               </w:rPr>
               <w:t xml:space="preserve">Gain, retention, SUS and task metrics recorded for both conditions</w:t>
+            </w:r>
+          </w:p>
+        </w:tc>
+        <w:tc>
+          <w:tcPr>
+            <w:tcW w:w="1500" w:type="dxa"/>
+          </w:tcPr>
+          <w:p>
+            <w:pPr>
+              <w:spacing w:after="0" w:line="240" w:lineRule="auto"/>
+              <w:jc w:val="left"/>
+            </w:pPr>
+            <w:r>
+              <w:rPr>
+                <w:sz w:val="18"/>
+                <w:szCs w:val="18"/>
+              </w:rPr>
+              <w:t xml:space="preserve">NFR-08</w:t>
+            </w:r>
+          </w:p>
+        </w:tc>
+      </w:tr>
+      <w:tr>
+        <w:trPr>
+          <w:cantSplit/>
+        </w:trPr>
+        <w:tc>
+          <w:tcPr>
+            <w:tcW w:w="900" w:type="dxa"/>
+          </w:tcPr>
+          <w:p>
+            <w:pPr>
+              <w:spacing w:after="0" w:line="240" w:lineRule="auto"/>
+              <w:jc w:val="left"/>
+            </w:pPr>
+            <w:r>
+              <w:rPr>
+                <w:sz w:val="18"/>
+                <w:szCs w:val="18"/>
+              </w:rPr>
+              <w:t xml:space="preserve">TC-28</w:t>
+            </w:r>
+          </w:p>
+        </w:tc>
+        <w:tc>
+          <w:tcPr>
+            <w:tcW w:w="3250" w:type="dxa"/>
+          </w:tcPr>
+          <w:p>
+            <w:pPr>
+              <w:spacing w:after="0" w:line="240" w:lineRule="auto"/>
+              <w:jc w:val="left"/>
+            </w:pPr>
+            <w:r>
+              <w:rPr>
+                <w:sz w:val="18"/>
+                <w:szCs w:val="18"/>
+              </w:rPr>
+              <w:t xml:space="preserve">Goal with a daily budget of 4 and of 61 minutes; subject list with a connected calendar</w:t>
+            </w:r>
+          </w:p>
+        </w:tc>
+        <w:tc>
+          <w:tcPr>
+            <w:tcW w:w="3376" w:type="dxa"/>
+          </w:tcPr>
+          <w:p>
+            <w:pPr>
+              <w:spacing w:after="0" w:line="240" w:lineRule="auto"/>
+              <w:jc w:val="left"/>
+            </w:pPr>
+            <w:r>
+              <w:rPr>
+                <w:sz w:val="18"/>
+                <w:szCs w:val="18"/>
+              </w:rPr>
+              <w:t xml:space="preserve">Out-of-range budgets return 422; course names from the Moodle calendar are offered as subjects</w:t>
+            </w:r>
+          </w:p>
+        </w:tc>
+        <w:tc>
+          <w:tcPr>
+            <w:tcW w:w="1500" w:type="dxa"/>
+          </w:tcPr>
+          <w:p>
+            <w:pPr>
+              <w:spacing w:after="0" w:line="240" w:lineRule="auto"/>
+              <w:jc w:val="left"/>
+            </w:pPr>
+            <w:r>
+              <w:rPr>
+                <w:sz w:val="18"/>
+                <w:szCs w:val="18"/>
+              </w:rPr>
+              <w:t xml:space="preserve">FR-05</w:t>
+            </w:r>
+          </w:p>
+        </w:tc>
+      </w:tr>
+      <w:tr>
+        <w:trPr>
+          <w:cantSplit/>
+        </w:trPr>
+        <w:tc>
+          <w:tcPr>
+            <w:tcW w:w="900" w:type="dxa"/>
+          </w:tcPr>
+          <w:p>
+            <w:pPr>
+              <w:spacing w:after="0" w:line="240" w:lineRule="auto"/>
+              <w:jc w:val="left"/>
+            </w:pPr>
+            <w:r>
+              <w:rPr>
+                <w:sz w:val="18"/>
+                <w:szCs w:val="18"/>
+              </w:rPr>
+              <w:t xml:space="preserve">TC-29</w:t>
+            </w:r>
+          </w:p>
+        </w:tc>
+        <w:tc>
+          <w:tcPr>
+            <w:tcW w:w="3250" w:type="dxa"/>
+          </w:tcPr>
+          <w:p>
+            <w:pPr>
+              <w:spacing w:after="0" w:line="240" w:lineRule="auto"/>
+              <w:jc w:val="left"/>
+            </w:pPr>
+            <w:r>
+              <w:rPr>
+                <w:sz w:val="18"/>
+                <w:szCs w:val="18"/>
+              </w:rPr>
+              <w:t xml:space="preserve">Video playback with the keyboard only</w:t>
+            </w:r>
+          </w:p>
+        </w:tc>
+        <w:tc>
+          <w:tcPr>
+            <w:tcW w:w="3376" w:type="dxa"/>
+          </w:tcPr>
+          <w:p>
+            <w:pPr>
+              <w:spacing w:after="0" w:line="240" w:lineRule="auto"/>
+              <w:jc w:val="left"/>
+            </w:pPr>
+            <w:r>
+              <w:rPr>
+                <w:sz w:val="18"/>
+                <w:szCs w:val="18"/>
+              </w:rPr>
+              <w:t xml:space="preserve">Captions on by default and switchable; transcript searchable; speed control works; sources panel lists the unit paragraphs</w:t>
+            </w:r>
+          </w:p>
+        </w:tc>
+        <w:tc>
+          <w:tcPr>
+            <w:tcW w:w="1500" w:type="dxa"/>
+          </w:tcPr>
+          <w:p>
+            <w:pPr>
+              <w:spacing w:after="0" w:line="240" w:lineRule="auto"/>
+              <w:jc w:val="left"/>
+            </w:pPr>
+            <w:r>
+              <w:rPr>
+                <w:sz w:val="18"/>
+                <w:szCs w:val="18"/>
+              </w:rPr>
+              <w:t xml:space="preserve">FR-24, NFR-09</w:t>
+            </w:r>
+          </w:p>
+        </w:tc>
+      </w:tr>
+      <w:tr>
+        <w:trPr>
+          <w:cantSplit/>
+        </w:trPr>
+        <w:tc>
+          <w:tcPr>
+            <w:tcW w:w="900" w:type="dxa"/>
+          </w:tcPr>
+          <w:p>
+            <w:pPr>
+              <w:spacing w:after="0" w:line="240" w:lineRule="auto"/>
+              <w:jc w:val="left"/>
+            </w:pPr>
+            <w:r>
+              <w:rPr>
+                <w:sz w:val="18"/>
+                <w:szCs w:val="18"/>
+              </w:rPr>
+              <w:t xml:space="preserve">TC-30</w:t>
+            </w:r>
+          </w:p>
+        </w:tc>
+        <w:tc>
+          <w:tcPr>
+            <w:tcW w:w="3250" w:type="dxa"/>
+          </w:tcPr>
+          <w:p>
+            <w:pPr>
+              <w:spacing w:after="0" w:line="240" w:lineRule="auto"/>
+              <w:jc w:val="left"/>
+            </w:pPr>
+            <w:r>
+              <w:rPr>
+                <w:sz w:val="18"/>
+                <w:szCs w:val="18"/>
+              </w:rPr>
+              <w:t xml:space="preserve">Question bank of a pilot skill after generation</w:t>
+            </w:r>
+          </w:p>
+        </w:tc>
+        <w:tc>
+          <w:tcPr>
+            <w:tcW w:w="3376" w:type="dxa"/>
+          </w:tcPr>
+          <w:p>
+            <w:pPr>
+              <w:spacing w:after="0" w:line="240" w:lineRule="auto"/>
+              <w:jc w:val="left"/>
+            </w:pPr>
+            <w:r>
+              <w:rPr>
+                <w:sz w:val="18"/>
+                <w:szCs w:val="18"/>
+              </w:rPr>
+              <w:t xml:space="preserve">≥ 5 validated questions; items failing schema, key or distractor checks stay drafts and are never served</w:t>
+            </w:r>
+          </w:p>
+        </w:tc>
+        <w:tc>
+          <w:tcPr>
+            <w:tcW w:w="1500" w:type="dxa"/>
+          </w:tcPr>
+          <w:p>
+            <w:pPr>
+              <w:spacing w:after="0" w:line="240" w:lineRule="auto"/>
+              <w:jc w:val="left"/>
+            </w:pPr>
+            <w:r>
+              <w:rPr>
+                <w:sz w:val="18"/>
+                <w:szCs w:val="18"/>
+              </w:rPr>
+              <w:t xml:space="preserve">FR-25</w:t>
+            </w:r>
+          </w:p>
+        </w:tc>
+      </w:tr>
+      <w:tr>
+        <w:trPr>
+          <w:cantSplit/>
+        </w:trPr>
+        <w:tc>
+          <w:tcPr>
+            <w:tcW w:w="900" w:type="dxa"/>
+          </w:tcPr>
+          <w:p>
+            <w:pPr>
+              <w:spacing w:after="0" w:line="240" w:lineRule="auto"/>
+              <w:jc w:val="left"/>
+            </w:pPr>
+            <w:r>
+              <w:rPr>
+                <w:sz w:val="18"/>
+                <w:szCs w:val="18"/>
+              </w:rPr>
+              <w:t xml:space="preserve">TC-31</w:t>
+            </w:r>
+          </w:p>
+        </w:tc>
+        <w:tc>
+          <w:tcPr>
+            <w:tcW w:w="3250" w:type="dxa"/>
+          </w:tcPr>
+          <w:p>
+            <w:pPr>
+              <w:spacing w:after="0" w:line="240" w:lineRule="auto"/>
+              <w:jc w:val="left"/>
+            </w:pPr>
+            <w:r>
+              <w:rPr>
+                <w:sz w:val="18"/>
+                <w:szCs w:val="18"/>
+              </w:rPr>
+              <w:t xml:space="preserve">Mastery report of a seeded learner</w:t>
+            </w:r>
+          </w:p>
+        </w:tc>
+        <w:tc>
+          <w:tcPr>
+            <w:tcW w:w="3376" w:type="dxa"/>
+          </w:tcPr>
+          <w:p>
+            <w:pPr>
+              <w:spacing w:after="0" w:line="240" w:lineRule="auto"/>
+              <w:jc w:val="left"/>
+            </w:pPr>
+            <w:r>
+              <w:rPr>
+                <w:sz w:val="18"/>
+                <w:szCs w:val="18"/>
+              </w:rPr>
+              <w:t xml:space="preserve">Values equal stored mastery; weak skills first; links to recommended units</w:t>
+            </w:r>
+          </w:p>
+        </w:tc>
+        <w:tc>
+          <w:tcPr>
+            <w:tcW w:w="1500" w:type="dxa"/>
+          </w:tcPr>
+          <w:p>
+            <w:pPr>
+              <w:spacing w:after="0" w:line="240" w:lineRule="auto"/>
+              <w:jc w:val="left"/>
+            </w:pPr>
+            <w:r>
+              <w:rPr>
+                <w:sz w:val="18"/>
+                <w:szCs w:val="18"/>
+              </w:rPr>
+              <w:t xml:space="preserve">FR-30</w:t>
+            </w:r>
+          </w:p>
+        </w:tc>
+      </w:tr>
+      <w:tr>
+        <w:trPr>
+          <w:cantSplit/>
+        </w:trPr>
+        <w:tc>
+          <w:tcPr>
+            <w:tcW w:w="900" w:type="dxa"/>
+          </w:tcPr>
+          <w:p>
+            <w:pPr>
+              <w:spacing w:after="0" w:line="240" w:lineRule="auto"/>
+              <w:jc w:val="left"/>
+            </w:pPr>
+            <w:r>
+              <w:rPr>
+                <w:sz w:val="18"/>
+                <w:szCs w:val="18"/>
+              </w:rPr>
+              <w:t xml:space="preserve">TC-32</w:t>
+            </w:r>
+          </w:p>
+        </w:tc>
+        <w:tc>
+          <w:tcPr>
+            <w:tcW w:w="3250" w:type="dxa"/>
+          </w:tcPr>
+          <w:p>
+            <w:pPr>
+              <w:spacing w:after="0" w:line="240" w:lineRule="auto"/>
+              <w:jc w:val="left"/>
+            </w:pPr>
+            <w:r>
+              <w:rPr>
+                <w:sz w:val="18"/>
+                <w:szCs w:val="18"/>
+              </w:rPr>
+              <w:t xml:space="preserve">Friend request, acceptance and blocking</w:t>
+            </w:r>
+          </w:p>
+        </w:tc>
+        <w:tc>
+          <w:tcPr>
+            <w:tcW w:w="3376" w:type="dxa"/>
+          </w:tcPr>
+          <w:p>
+            <w:pPr>
+              <w:spacing w:after="0" w:line="240" w:lineRule="auto"/>
+              <w:jc w:val="left"/>
+            </w:pPr>
+            <w:r>
+              <w:rPr>
+                <w:sz w:val="18"/>
+                <w:szCs w:val="18"/>
+              </w:rPr>
+              <w:t xml:space="preserve">Friends-only items visible only to accepted friends; a blocked user disappears from feed and search</w:t>
+            </w:r>
+          </w:p>
+        </w:tc>
+        <w:tc>
+          <w:tcPr>
+            <w:tcW w:w="1500" w:type="dxa"/>
+          </w:tcPr>
+          <w:p>
+            <w:pPr>
+              <w:spacing w:after="0" w:line="240" w:lineRule="auto"/>
+              <w:jc w:val="left"/>
+            </w:pPr>
+            <w:r>
+              <w:rPr>
+                <w:sz w:val="18"/>
+                <w:szCs w:val="18"/>
+              </w:rPr>
+              <w:t xml:space="preserve">FR-31</w:t>
+            </w:r>
+          </w:p>
+        </w:tc>
+      </w:tr>
+      <w:tr>
+        <w:trPr>
+          <w:cantSplit/>
+        </w:trPr>
+        <w:tc>
+          <w:tcPr>
+            <w:tcW w:w="900" w:type="dxa"/>
+          </w:tcPr>
+          <w:p>
+            <w:pPr>
+              <w:spacing w:after="0" w:line="240" w:lineRule="auto"/>
+              <w:jc w:val="left"/>
+            </w:pPr>
+            <w:r>
+              <w:rPr>
+                <w:sz w:val="18"/>
+                <w:szCs w:val="18"/>
+              </w:rPr>
+              <w:t xml:space="preserve">TC-33</w:t>
+            </w:r>
+          </w:p>
+        </w:tc>
+        <w:tc>
+          <w:tcPr>
+            <w:tcW w:w="3250" w:type="dxa"/>
+          </w:tcPr>
+          <w:p>
+            <w:pPr>
+              <w:spacing w:after="0" w:line="240" w:lineRule="auto"/>
+              <w:jc w:val="left"/>
+            </w:pPr>
+            <w:r>
+              <w:rPr>
+                <w:sz w:val="18"/>
+                <w:szCs w:val="18"/>
+              </w:rPr>
+              <w:t xml:space="preserve">Report of a video, a question and a feedback item</w:t>
+            </w:r>
+          </w:p>
+        </w:tc>
+        <w:tc>
+          <w:tcPr>
+            <w:tcW w:w="3376" w:type="dxa"/>
+          </w:tcPr>
+          <w:p>
+            <w:pPr>
+              <w:spacing w:after="0" w:line="240" w:lineRule="auto"/>
+              <w:jc w:val="left"/>
+            </w:pPr>
+            <w:r>
+              <w:rPr>
+                <w:sz w:val="18"/>
+                <w:szCs w:val="18"/>
+              </w:rPr>
+              <w:t xml:space="preserve">Moderation record with a content snapshot created within 5 s</w:t>
+            </w:r>
+          </w:p>
+        </w:tc>
+        <w:tc>
+          <w:tcPr>
+            <w:tcW w:w="1500" w:type="dxa"/>
+          </w:tcPr>
+          <w:p>
+            <w:pPr>
+              <w:spacing w:after="0" w:line="240" w:lineRule="auto"/>
+              <w:jc w:val="left"/>
+            </w:pPr>
+            <w:r>
+              <w:rPr>
+                <w:sz w:val="18"/>
+                <w:szCs w:val="18"/>
+              </w:rPr>
+              <w:t xml:space="preserve">FR-35</w:t>
+            </w:r>
+          </w:p>
+        </w:tc>
+      </w:tr>
+      <w:tr>
+        <w:trPr>
+          <w:cantSplit/>
+        </w:trPr>
+        <w:tc>
+          <w:tcPr>
+            <w:tcW w:w="900" w:type="dxa"/>
+          </w:tcPr>
+          <w:p>
+            <w:pPr>
+              <w:spacing w:after="0" w:line="240" w:lineRule="auto"/>
+              <w:jc w:val="left"/>
+            </w:pPr>
+            <w:r>
+              <w:rPr>
+                <w:sz w:val="18"/>
+                <w:szCs w:val="18"/>
+              </w:rPr>
+              <w:t xml:space="preserve">TC-34</w:t>
+            </w:r>
+          </w:p>
+        </w:tc>
+        <w:tc>
+          <w:tcPr>
+            <w:tcW w:w="3250" w:type="dxa"/>
+          </w:tcPr>
+          <w:p>
+            <w:pPr>
+              <w:spacing w:after="0" w:line="240" w:lineRule="auto"/>
+              <w:jc w:val="left"/>
+            </w:pPr>
+            <w:r>
+              <w:rPr>
+                <w:sz w:val="18"/>
+                <w:szCs w:val="18"/>
+              </w:rPr>
+              <w:t xml:space="preserve">Seven days without activity (fake clock)</w:t>
+            </w:r>
+          </w:p>
+        </w:tc>
+        <w:tc>
+          <w:tcPr>
+            <w:tcW w:w="3376" w:type="dxa"/>
+          </w:tcPr>
+          <w:p>
+            <w:pPr>
+              <w:spacing w:after="0" w:line="240" w:lineRule="auto"/>
+              <w:jc w:val="left"/>
+            </w:pPr>
+            <w:r>
+              <w:rPr>
+                <w:sz w:val="18"/>
+                <w:szCs w:val="18"/>
+              </w:rPr>
+              <w:t xml:space="preserve">No XP, coins, mastery or progress removed; a paused streak resumes without loss</w:t>
+            </w:r>
+          </w:p>
+        </w:tc>
+        <w:tc>
+          <w:tcPr>
+            <w:tcW w:w="1500" w:type="dxa"/>
+          </w:tcPr>
+          <w:p>
+            <w:pPr>
+              <w:spacing w:after="0" w:line="240" w:lineRule="auto"/>
+              <w:jc w:val="left"/>
+            </w:pPr>
+            <w:r>
+              <w:rPr>
+                <w:sz w:val="18"/>
+                <w:szCs w:val="18"/>
+              </w:rPr>
+              <w:t xml:space="preserve">FR-38</w:t>
+            </w:r>
+          </w:p>
+        </w:tc>
+      </w:tr>
+      <w:tr>
+        <w:trPr>
+          <w:cantSplit/>
+        </w:trPr>
+        <w:tc>
+          <w:tcPr>
+            <w:tcW w:w="900" w:type="dxa"/>
+          </w:tcPr>
+          <w:p>
+            <w:pPr>
+              <w:spacing w:after="0" w:line="240" w:lineRule="auto"/>
+              <w:jc w:val="left"/>
+            </w:pPr>
+            <w:r>
+              <w:rPr>
+                <w:sz w:val="18"/>
+                <w:szCs w:val="18"/>
+              </w:rPr>
+              <w:t xml:space="preserve">TC-35</w:t>
+            </w:r>
+          </w:p>
+        </w:tc>
+        <w:tc>
+          <w:tcPr>
+            <w:tcW w:w="3250" w:type="dxa"/>
+          </w:tcPr>
+          <w:p>
+            <w:pPr>
+              <w:spacing w:after="0" w:line="240" w:lineRule="auto"/>
+              <w:jc w:val="left"/>
+            </w:pPr>
+            <w:r>
+              <w:rPr>
+                <w:sz w:val="18"/>
+                <w:szCs w:val="18"/>
+              </w:rPr>
+              <w:t xml:space="preserve">Learning events with and without analytics consent; evaluation export</w:t>
+            </w:r>
+          </w:p>
+        </w:tc>
+        <w:tc>
+          <w:tcPr>
+            <w:tcW w:w="3376" w:type="dxa"/>
+          </w:tcPr>
+          <w:p>
+            <w:pPr>
+              <w:spacing w:after="0" w:line="240" w:lineRule="auto"/>
+              <w:jc w:val="left"/>
+            </w:pPr>
+            <w:r>
+              <w:rPr>
+                <w:sz w:val="18"/>
+                <w:szCs w:val="18"/>
+              </w:rPr>
+              <w:t xml:space="preserve">Events logged only with consent; export contains unit view, watch %, question ID, correctness and response time, but no name, e-mail or account ID</w:t>
+            </w:r>
+          </w:p>
+        </w:tc>
+        <w:tc>
+          <w:tcPr>
+            <w:tcW w:w="1500" w:type="dxa"/>
+          </w:tcPr>
+          <w:p>
+            <w:pPr>
+              <w:spacing w:after="0" w:line="240" w:lineRule="auto"/>
+              <w:jc w:val="left"/>
+            </w:pPr>
+            <w:r>
+              <w:rPr>
+                <w:sz w:val="18"/>
+                <w:szCs w:val="18"/>
+              </w:rPr>
+              <w:t xml:space="preserve">FR-41, NFR-06</w:t>
+            </w:r>
+          </w:p>
+        </w:tc>
+      </w:tr>
+      <w:tr>
+        <w:trPr>
+          <w:cantSplit/>
+        </w:trPr>
+        <w:tc>
+          <w:tcPr>
+            <w:tcW w:w="900" w:type="dxa"/>
+          </w:tcPr>
+          <w:p>
+            <w:pPr>
+              <w:spacing w:after="0" w:line="240" w:lineRule="auto"/>
+              <w:jc w:val="left"/>
+            </w:pPr>
+            <w:r>
+              <w:rPr>
+                <w:sz w:val="18"/>
+                <w:szCs w:val="18"/>
+              </w:rPr>
+              <w:t xml:space="preserve">TC-36</w:t>
+            </w:r>
+          </w:p>
+        </w:tc>
+        <w:tc>
+          <w:tcPr>
+            <w:tcW w:w="3250" w:type="dxa"/>
+          </w:tcPr>
+          <w:p>
+            <w:pPr>
+              <w:spacing w:after="0" w:line="240" w:lineRule="auto"/>
+              <w:jc w:val="left"/>
+            </w:pPr>
+            <w:r>
+              <w:rPr>
+                <w:sz w:val="18"/>
+                <w:szCs w:val="18"/>
+              </w:rPr>
+              <w:t xml:space="preserve">Batch of 50 video jobs (benchmark B3)</w:t>
+            </w:r>
+          </w:p>
+        </w:tc>
+        <w:tc>
+          <w:tcPr>
+            <w:tcW w:w="3376" w:type="dxa"/>
+          </w:tcPr>
+          <w:p>
+            <w:pPr>
+              <w:spacing w:after="0" w:line="240" w:lineRule="auto"/>
+              <w:jc w:val="left"/>
+            </w:pPr>
+            <w:r>
+              <w:rPr>
+                <w:sz w:val="18"/>
+                <w:szCs w:val="18"/>
+              </w:rPr>
+              <w:t xml:space="preserve">p90 time to ready ≤ 5 min; failure rate &lt; 10 % after retries</w:t>
+            </w:r>
+          </w:p>
+        </w:tc>
+        <w:tc>
+          <w:tcPr>
+            <w:tcW w:w="1500" w:type="dxa"/>
+          </w:tcPr>
+          <w:p>
+            <w:pPr>
+              <w:spacing w:after="0" w:line="240" w:lineRule="auto"/>
+              <w:jc w:val="left"/>
+            </w:pPr>
+            <w:r>
+              <w:rPr>
+                <w:sz w:val="18"/>
+                <w:szCs w:val="18"/>
+              </w:rPr>
+              <w:t xml:space="preserve">NFR-03</w:t>
+            </w:r>
+          </w:p>
+        </w:tc>
+      </w:tr>
+      <w:tr>
+        <w:trPr>
+          <w:cantSplit/>
+        </w:trPr>
+        <w:tc>
+          <w:tcPr>
+            <w:tcW w:w="900" w:type="dxa"/>
+          </w:tcPr>
+          <w:p>
+            <w:pPr>
+              <w:spacing w:after="0" w:line="240" w:lineRule="auto"/>
+              <w:jc w:val="left"/>
+            </w:pPr>
+            <w:r>
+              <w:rPr>
+                <w:sz w:val="18"/>
+                <w:szCs w:val="18"/>
+              </w:rPr>
+              <w:t xml:space="preserve">TC-37</w:t>
+            </w:r>
+          </w:p>
+        </w:tc>
+        <w:tc>
+          <w:tcPr>
+            <w:tcW w:w="3250" w:type="dxa"/>
+          </w:tcPr>
+          <w:p>
+            <w:pPr>
+              <w:spacing w:after="0" w:line="240" w:lineRule="auto"/>
+              <w:jc w:val="left"/>
+            </w:pPr>
+            <w:r>
+              <w:rPr>
+                <w:sz w:val="18"/>
+                <w:szCs w:val="18"/>
+              </w:rPr>
+              <w:t xml:space="preserve">Core flows at 320, 390 and 1440 px; Lighthouse mobile audit; installation</w:t>
+            </w:r>
+          </w:p>
+        </w:tc>
+        <w:tc>
+          <w:tcPr>
+            <w:tcW w:w="3376" w:type="dxa"/>
+          </w:tcPr>
+          <w:p>
+            <w:pPr>
+              <w:spacing w:after="0" w:line="240" w:lineRule="auto"/>
+              <w:jc w:val="left"/>
+            </w:pPr>
+            <w:r>
+              <w:rPr>
+                <w:sz w:val="18"/>
+                <w:szCs w:val="18"/>
+              </w:rPr>
+              <w:t xml:space="preserve">No horizontal scroll; Lighthouse performance ≥ 80; installable on Android and iOS</w:t>
+            </w:r>
+          </w:p>
+        </w:tc>
+        <w:tc>
+          <w:tcPr>
+            <w:tcW w:w="1500" w:type="dxa"/>
+          </w:tcPr>
+          <w:p>
+            <w:pPr>
+              <w:spacing w:after="0" w:line="240" w:lineRule="auto"/>
+              <w:jc w:val="left"/>
+            </w:pPr>
+            <w:r>
+              <w:rPr>
+                <w:sz w:val="18"/>
+                <w:szCs w:val="18"/>
+              </w:rPr>
+              <w:t xml:space="preserve">NFR-10</w:t>
             </w:r>
           </w:p>
         </w:tc>
@@ -43025,7 +44426,7 @@
     <w:p>
       <w:pPr/>
       <w:r>
-        <w:t xml:space="preserve">The release is tagged and deployed to staging. Test databases, storage buckets and benchmark data sets are initialized so that no data from earlier runs is reused.</w:t>
+        <w:t xml:space="preserve">The release is tagged and deployed to staging. Test databases and benchmark data sets are initialized so that no data from earlier runs is reused.</w:t>
       </w:r>
     </w:p>
     <w:p>
@@ -43188,7 +44589,7 @@
         <w:spacing w:after="40"/>
       </w:pPr>
       <w:r>
-        <w:t xml:space="preserve">Higher learning gain in the YeahGrind condition than in the baseline, with good usability.</w:t>
+        <w:t xml:space="preserve">An estimate of the learning gain relative to the baseline (target: a median paired difference of at least 0.10) and good usability (SUS ≥ 70).</w:t>
       </w:r>
     </w:p>
     <w:p>
@@ -45946,6 +47347,101 @@
                 <w:szCs w:val="18"/>
               </w:rPr>
               <w:t xml:space="preserve">Own accounts; PR review by the other member; weekly board review</w:t>
+            </w:r>
+          </w:p>
+        </w:tc>
+      </w:tr>
+      <w:tr>
+        <w:trPr>
+          <w:cantSplit/>
+        </w:trPr>
+        <w:tc>
+          <w:tcPr>
+            <w:tcW w:w="700" w:type="dxa"/>
+          </w:tcPr>
+          <w:p>
+            <w:pPr>
+              <w:spacing w:after="0" w:line="240" w:lineRule="auto"/>
+              <w:jc w:val="left"/>
+            </w:pPr>
+            <w:r>
+              <w:rPr>
+                <w:sz w:val="18"/>
+                <w:szCs w:val="18"/>
+              </w:rPr>
+              <w:t xml:space="preserve">R-13</w:t>
+            </w:r>
+          </w:p>
+        </w:tc>
+        <w:tc>
+          <w:tcPr>
+            <w:tcW w:w="2700" w:type="dxa"/>
+          </w:tcPr>
+          <w:p>
+            <w:pPr>
+              <w:spacing w:after="0" w:line="240" w:lineRule="auto"/>
+              <w:jc w:val="left"/>
+            </w:pPr>
+            <w:r>
+              <w:rPr>
+                <w:sz w:val="18"/>
+                <w:szCs w:val="18"/>
+              </w:rPr>
+              <w:t xml:space="preserve">Free-tier AI terms allow the provider to use submitted content</w:t>
+            </w:r>
+          </w:p>
+        </w:tc>
+        <w:tc>
+          <w:tcPr>
+            <w:tcW w:w="1200" w:type="dxa"/>
+          </w:tcPr>
+          <w:p>
+            <w:pPr>
+              <w:spacing w:after="0" w:line="240" w:lineRule="auto"/>
+              <w:jc w:val="left"/>
+            </w:pPr>
+            <w:r>
+              <w:rPr>
+                <w:sz w:val="18"/>
+                <w:szCs w:val="18"/>
+              </w:rPr>
+              <w:t xml:space="preserve">Medium</w:t>
+            </w:r>
+          </w:p>
+        </w:tc>
+        <w:tc>
+          <w:tcPr>
+            <w:tcW w:w="900" w:type="dxa"/>
+          </w:tcPr>
+          <w:p>
+            <w:pPr>
+              <w:spacing w:after="0" w:line="240" w:lineRule="auto"/>
+              <w:jc w:val="left"/>
+            </w:pPr>
+            <w:r>
+              <w:rPr>
+                <w:sz w:val="18"/>
+                <w:szCs w:val="18"/>
+              </w:rPr>
+              <w:t xml:space="preserve">High</w:t>
+            </w:r>
+          </w:p>
+        </w:tc>
+        <w:tc>
+          <w:tcPr>
+            <w:tcW w:w="3526" w:type="dxa"/>
+          </w:tcPr>
+          <w:p>
+            <w:pPr>
+              <w:spacing w:after="0" w:line="240" w:lineRule="auto"/>
+              <w:jc w:val="left"/>
+            </w:pPr>
+            <w:r>
+              <w:rPr>
+                <w:sz w:val="18"/>
+                <w:szCs w:val="18"/>
+              </w:rPr>
+              <w:t xml:space="preserve">Free tier only with synthetic test content; paid tier without use of content before any student material is narrated (NFR-06); provider terms checked before the pilot</w:t>
             </w:r>
           </w:p>
         </w:tc>

</xml_diff>